<commit_message>
Polish pass on dissertation: consistency fixes (lowercase 'minimal', em-dash, fix Section 6.10 cross-ref to 8.4)
</commit_message>
<xml_diff>
--- a/thesis_writeup/dissertation_current.docx
+++ b/thesis_writeup/dissertation_current.docx
@@ -2748,13 +2748,13 @@
         <w:pStyle w:val="31"/>
       </w:pPr>
       <w:r>
-        <w:t>3.2.2 FakeNewsNet Minimal titles (target)</w:t>
+        <w:t>3.2.2 FakeNewsNet minimal titles (target)</w:t>
       </w:r>
     </w:p>
     <w:p>
       <w:pPr/>
       <w:r>
-        <w:t>FakeNewsNet Minimal is the target dataset; it is introduced in Section 2.1, so this chapter only describes how it is used. It is used as title-only text with binary REAL/FAKE labels; after cleaning, the combined target set contains 23,196 titles drawn from two source subparts, PolitiFact (political) and GossipCop (entertainment), and is larger and more imbalanced than LIAR (Table 3.2). Both forms are used: the combined set for the main LIAR-to-FakeNewsNet transfer (E3-E4), and the two subparts separately for the within-FakeNewsNet transfer experiment (E7).</w:t>
+        <w:t>FakeNewsNet minimal is the target dataset; it is introduced in Section 2.1, so this chapter only describes how it is used. It is used as title-only text with binary REAL/FAKE labels; after cleaning, the combined target set contains 23,196 titles drawn from two source subparts, PolitiFact (political) and GossipCop (entertainment), and is larger and more imbalanced than LIAR (Table 3.2). Both forms are used: the combined set for the main LIAR-to-FakeNewsNet transfer (E3-E4), and the two subparts separately for the within-FakeNewsNet transfer experiment (E7).</w:t>
       </w:r>
     </w:p>
     <w:p>
@@ -6756,7 +6756,7 @@
         <w:jc w:val="both"/>
       </w:pPr>
       <w:r>
-        <w:t>Three primary transfer baselines are reported--TF-IDF + Logistic Regression, weighted BERT, and weighted RoBERTa--together with an unweighted BERT control that is described in detail in Section 6.8. TF-IDF is trained on LIAR train plus validation using the selected deterministic baseline setup. The transformer baselines use the same five-seed runs as the LIAR experiments, with checkpoint selection based on LIAR validation Macro-F1. For each transformer run, the best LIAR checkpoint is loaded before testing on both LIAR test and FakeNewsNet titles.</w:t>
+        <w:t>Three primary transfer baselines are reported—TF-IDF + Logistic Regression, weighted BERT, and weighted RoBERTa—together with an unweighted BERT control that is described in detail in Section 6.8. TF-IDF is trained on LIAR train plus validation using the selected deterministic baseline setup. The transformer baselines use the same five-seed runs as the LIAR experiments, with checkpoint selection based on LIAR validation Macro-F1. For each transformer run, the best LIAR checkpoint is loaded before testing on both LIAR test and FakeNewsNet titles.</w:t>
       </w:r>
     </w:p>
     <w:p>
@@ -11709,7 +11709,7 @@
         <w:jc w:val="both"/>
       </w:pPr>
       <w:r>
-        <w:t>A more plausible explanation is therefore distribution shift between LIAR statements and FakeNewsNet titles, rather than the choice of loss weighting. LIAR contains short political fact-checking claims, often written as direct accusations or factual statements; FakeNewsNet titles are news headlines, with a different style, a different topic distribution, and a different class prior. Both the weighted and unweighted BERT decision boundaries learned on LIAR appear to treat many title patterns as FAKE-like, producing a strong FAKE-heavy transfer bias. This reading is consistent with the recall-plane pattern in the recall comparison in Figure 6.4 and is the central evidence that strong in-domain performance does not imply transferable veracity signals. A complementary unweighted RoBERTa control is the obvious next experiment to confirm that the same effect appears in the RoBERTa family; this is not completed in the current dissertation and is recorded as a remaining methodological item in Section 6.10 and Chapter 7.</w:t>
+        <w:t>A more plausible explanation is therefore distribution shift between LIAR statements and FakeNewsNet titles, rather than the choice of loss weighting. LIAR contains short political fact-checking claims, often written as direct accusations or factual statements; FakeNewsNet titles are news headlines, with a different style, a different topic distribution, and a different class prior. Both the weighted and unweighted BERT decision boundaries learned on LIAR appear to treat many title patterns as FAKE-like, producing a strong FAKE-heavy transfer bias. This reading is consistent with the recall-plane pattern in the recall comparison in Figure 6.4 and is the central evidence that strong in-domain performance does not imply transferable veracity signals. A complementary unweighted RoBERTa control is the obvious next experiment to confirm that the same effect appears in the RoBERTa family; this is not completed in the current dissertation and is recorded as a remaining methodological item in Chapter 7 and Section 8.4.</w:t>
       </w:r>
     </w:p>
     <w:p>

</xml_diff>

<commit_message>
Apply supervisor (JG 2026-06-29) revision round: restructured abstract, 4 RQs, Ch5 merged into Ch4, chapters renumbered, best/second-best table highlighting with 5-seed paired t-tests
Adds results/significance_tests/ CSV and the paired t-test script; table notes clarify that high FAKE recall under transfer reflects prediction bias, not better detection.
</commit_message>
<xml_diff>
--- a/thesis_writeup/dissertation_current.docx
+++ b/thesis_writeup/dissertation_current.docx
@@ -212,7 +212,7 @@
         <w:jc w:val="both"/>
       </w:pPr>
       <w:r>
-        <w:t>Fake news detection has become an important task in natural language processing because unreliable information can spread quickly across online platforms. Many existing studies report strong performance when models are trained and tested within the same dataset. However, strong in-domain performance does not necessarily show that a detector will remain reliable when applied to another dataset with different topics, label rules, or writing styles.</w:t>
+        <w:t>Fake news detection has become an important task in natural language processing because unreliable information can spread quickly across online platforms. However, strong in-domain performance does not necessarily show that a model will remain reliable when applied to another dataset with different topics, label rules, or writing styles.</w:t>
       </w:r>
     </w:p>
     <w:p>
@@ -220,7 +220,7 @@
         <w:jc w:val="both"/>
       </w:pPr>
       <w:r>
-        <w:t>This dissertation investigates reproducible fake news detection baselines with a focus on a binary fake news detection task and cross-dataset behaviour. The project compares a traditional TF-IDF and Logistic Regression baseline with transformer-based models including BERT, RoBERTa, and their class-weighted loss variants. The evaluation reports Accuracy, Macro-F1, confusion matrices, and class-level recall, with special attention to FAKE recall because missing fake news can be more harmful than false alarms.</w:t>
+        <w:t>Most fake news detection studies still report results within a single dataset, which can hide cross-dataset failure. This dissertation addresses that gap by evaluating standard text-only classifiers with fixed splits, majority-class references, unweighted controls, five-seed transformer runs, and class-sensitive metrics rather than relying on a single aggregate score.</w:t>
       </w:r>
     </w:p>
     <w:p>
@@ -228,7 +228,7 @@
         <w:jc w:val="both"/>
       </w:pPr>
       <w:r>
-        <w:t>The LIAR experiments show that weighted RoBERTa obtains the highest mean Accuracy and Macro-F1 among the completed local baselines across five random seeds, although the gap to weighted BERT is modest. Weighted BERT obtains a lower Macro-F1 but a higher FAKE recall, showing a trade-off between overall performance and minority-class sensitivity. Prior work such as TELLER [9] reports higher LIAR performance using an LLM-based reasoning pipeline; this dissertation does not reproduce TELLER, and the reasoning-atom pilot below is only a simplified, exploratory probe inspired by it.</w:t>
+        <w:t>The study uses the LIAR benchmark of political fact-checking statements as the source dataset and FakeNewsNet minimal titles, drawn from PolitiFact and GossipCop, as the target dataset. It compares TF-IDF with Logistic Regression, BERT, RoBERTa, and class-weighted variants using Accuracy, Macro-F1, REAL recall, and FAKE recall. It then tests strict LIAR-to-FakeNewsNet transfer, intermediate fine-tuning with limited labelled FakeNewsNet target data, and within-FakeNewsNet subpart transfer.</w:t>
       </w:r>
     </w:p>
     <w:p>
@@ -236,7 +236,7 @@
         <w:jc w:val="both"/>
       </w:pPr>
       <w:r>
-        <w:t>The strict transfer experiments train on LIAR and evaluate on FakeNewsNet titles without target-domain adaptation. Under this setting, the weighted transformer baselines fall below a trivial majority-class (always-REAL) baseline on both Accuracy and Macro-F1, and a matched unweighted BERT control shows that distribution shift is the dominant cause of the failure. The thesis further evaluates intermediate target-domain fine-tuning as an adaptation strategy and includes a simplified TELLER-like LLM reasoning-atom pilot experiment. With 20% FakeNewsNet intermediate fine-tuning, weighted RoBERTa reaches a five-seed mean Macro-F1 of 0.7463 on the held-out target test split, while the TELLER-like pilot shows that coarse LLM-generated atoms do not remove cross-dataset bias by themselves.</w:t>
+        <w:t>In-domain, weighted RoBERTa obtains the highest local LIAR Macro-F1 (0.6396), although the paired five-seed tests do not make the local transformer ranking statistically decisive. Under strict transfer to held-out FakeNewsNet titles, the same model collapses to 0.2364 Macro-F1 and falls below the always-REAL majority baseline, with a strong FAKE prediction bias. A matched unweighted BERT control indicates that distribution shift, rather than class weighting alone, is the main cause. Intermediate target-domain fine-tuning substantially recovers performance: 10% target data reaches 0.7035 Macro-F1 and 20% reaches 0.7463, both significantly above direct transfer.</w:t>
       </w:r>
     </w:p>
     <w:p>
@@ -278,7 +278,6 @@
         <w:tab/>
         <w:t>1</w:t>
       </w:r>
-      <w:r/>
     </w:p>
     <w:p>
       <w:pPr>
@@ -292,7 +291,6 @@
         <w:tab/>
         <w:t>1</w:t>
       </w:r>
-      <w:r/>
     </w:p>
     <w:p>
       <w:pPr>
@@ -306,7 +304,6 @@
         <w:tab/>
         <w:t>1</w:t>
       </w:r>
-      <w:r/>
     </w:p>
     <w:p>
       <w:pPr>
@@ -320,7 +317,6 @@
         <w:tab/>
         <w:t>2</w:t>
       </w:r>
-      <w:r/>
     </w:p>
     <w:p>
       <w:pPr>
@@ -334,7 +330,6 @@
         <w:tab/>
         <w:t>2</w:t>
       </w:r>
-      <w:r/>
     </w:p>
     <w:p>
       <w:pPr>
@@ -346,9 +341,8 @@
       <w:r>
         <w:t xml:space="preserve">1.5 Outcomes </w:t>
         <w:tab/>
-        <w:t>2</w:t>
-      </w:r>
-      <w:r/>
+        <w:t>3</w:t>
+      </w:r>
     </w:p>
     <w:p>
       <w:pPr>
@@ -362,7 +356,6 @@
         <w:tab/>
         <w:t>3</w:t>
       </w:r>
-      <w:r/>
     </w:p>
     <w:p>
       <w:pPr>
@@ -376,7 +369,6 @@
         <w:tab/>
         <w:t>4</w:t>
       </w:r>
-      <w:r/>
     </w:p>
     <w:p>
       <w:pPr>
@@ -388,9 +380,8 @@
       <w:r>
         <w:t xml:space="preserve">3 Methodology </w:t>
         <w:tab/>
-        <w:t>9</w:t>
-      </w:r>
-      <w:r/>
+        <w:t>10</w:t>
+      </w:r>
     </w:p>
     <w:p>
       <w:pPr>
@@ -400,11 +391,10 @@
         <w:ind w:left="340" w:right="340"/>
       </w:pPr>
       <w:r>
-        <w:t xml:space="preserve">4 LIAR In-Domain Experiments </w:t>
+        <w:t xml:space="preserve">4 LIAR In-Domain Experiments and Error Analysis </w:t>
         <w:tab/>
-        <w:t>16</w:t>
-      </w:r>
-      <w:r/>
+        <w:t>18</w:t>
+      </w:r>
     </w:p>
     <w:p>
       <w:pPr>
@@ -414,11 +404,10 @@
         <w:ind w:left="340" w:right="340"/>
       </w:pPr>
       <w:r>
-        <w:t xml:space="preserve">5 Error Analysis and Further Experiments </w:t>
+        <w:t xml:space="preserve">5 Cross-Dataset Evaluation </w:t>
         <w:tab/>
-        <w:t>21</w:t>
-      </w:r>
-      <w:r/>
+        <w:t>27</w:t>
+      </w:r>
     </w:p>
     <w:p>
       <w:pPr>
@@ -428,11 +417,10 @@
         <w:ind w:left="340" w:right="340"/>
       </w:pPr>
       <w:r>
-        <w:t xml:space="preserve">6 Cross-Dataset Evaluation </w:t>
+        <w:t xml:space="preserve">6 Discussion </w:t>
         <w:tab/>
-        <w:t>25</w:t>
-      </w:r>
-      <w:r/>
+        <w:t>39</w:t>
+      </w:r>
     </w:p>
     <w:p>
       <w:pPr>
@@ -442,11 +430,10 @@
         <w:ind w:left="340" w:right="340"/>
       </w:pPr>
       <w:r>
-        <w:t xml:space="preserve">7 Discussion </w:t>
+        <w:t xml:space="preserve">7 Conclusion </w:t>
         <w:tab/>
-        <w:t>36</w:t>
-      </w:r>
-      <w:r/>
+        <w:t>45</w:t>
+      </w:r>
     </w:p>
     <w:p>
       <w:pPr>
@@ -456,11 +443,10 @@
         <w:ind w:left="340" w:right="340"/>
       </w:pPr>
       <w:r>
-        <w:t xml:space="preserve">8 Conclusion </w:t>
+        <w:t xml:space="preserve">References </w:t>
         <w:tab/>
-        <w:t>42</w:t>
-      </w:r>
-      <w:r/>
+        <w:t>48</w:t>
+      </w:r>
     </w:p>
     <w:p>
       <w:pPr>
@@ -470,11 +456,10 @@
         <w:ind w:left="340" w:right="340"/>
       </w:pPr>
       <w:r>
-        <w:t xml:space="preserve">References </w:t>
+        <w:t xml:space="preserve">Appendices </w:t>
         <w:tab/>
-        <w:t>45</w:t>
-      </w:r>
-      <w:r/>
+        <w:t>51</w:t>
+      </w:r>
     </w:p>
     <w:p>
       <w:pPr>
@@ -483,17 +468,10 @@
         </w:tabs>
         <w:ind w:left="340" w:right="340"/>
       </w:pPr>
-      <w:r>
-        <w:t xml:space="preserve">Appendices </w:t>
-        <w:tab/>
-        <w:t>48</w:t>
-      </w:r>
       <w:r/>
     </w:p>
     <w:p>
-      <w:r>
-        <w:br w:type="page"/>
-      </w:r>
+      <w:r/>
     </w:p>
     <w:p>
       <w:pPr>
@@ -515,9 +493,8 @@
       <w:r>
         <w:t xml:space="preserve">4.1 LIAR in-domain performance comparison across local baselines </w:t>
         <w:tab/>
-        <w:t>18</w:t>
-      </w:r>
-      <w:r/>
+        <w:t>20</w:t>
+      </w:r>
     </w:p>
     <w:p>
       <w:pPr>
@@ -529,9 +506,8 @@
       <w:r>
         <w:t xml:space="preserve">4.2 REAL and FAKE recall trade-off on the LIAR test set </w:t>
         <w:tab/>
-        <w:t>18</w:t>
-      </w:r>
-      <w:r/>
+        <w:t>21</w:t>
+      </w:r>
     </w:p>
     <w:p>
       <w:pPr>
@@ -541,11 +517,10 @@
         <w:ind w:left="340" w:right="340"/>
       </w:pPr>
       <w:r>
-        <w:t xml:space="preserve">5.1 Qualitative taxonomy of recurring LIAR error patterns </w:t>
+        <w:t xml:space="preserve">4.3 Qualitative taxonomy of recurring LIAR error patterns </w:t>
         <w:tab/>
-        <w:t>21</w:t>
-      </w:r>
-      <w:r/>
+        <w:t>23</w:t>
+      </w:r>
     </w:p>
     <w:p>
       <w:pPr>
@@ -555,11 +530,10 @@
         <w:ind w:left="340" w:right="340"/>
       </w:pPr>
       <w:r>
-        <w:t xml:space="preserve">6.1 Macro-F1 on LIAR and FakeNewsNet combined titles </w:t>
+        <w:t xml:space="preserve">5.1 Macro-F1 on LIAR and FakeNewsNet combined titles </w:t>
         <w:tab/>
-        <w:t>27</w:t>
-      </w:r>
-      <w:r/>
+        <w:t>30</w:t>
+      </w:r>
     </w:p>
     <w:p>
       <w:pPr>
@@ -569,11 +543,10 @@
         <w:ind w:left="340" w:right="340"/>
       </w:pPr>
       <w:r>
-        <w:t xml:space="preserve">6.2 Class-level recall on FakeNewsNet combined titles </w:t>
+        <w:t xml:space="preserve">5.2 Class-level recall on FakeNewsNet combined titles </w:t>
         <w:tab/>
-        <w:t>28</w:t>
-      </w:r>
-      <w:r/>
+        <w:t>30</w:t>
+      </w:r>
     </w:p>
     <w:p>
       <w:pPr>
@@ -583,11 +556,10 @@
         <w:ind w:left="340" w:right="340"/>
       </w:pPr>
       <w:r>
-        <w:t xml:space="preserve">6.3 Majority baseline comparison on FakeNewsNet combined titles </w:t>
+        <w:t xml:space="preserve">5.3 Majority baseline comparison on FakeNewsNet combined titles </w:t>
         <w:tab/>
-        <w:t>28</w:t>
-      </w:r>
-      <w:r/>
+        <w:t>31</w:t>
+      </w:r>
     </w:p>
     <w:p>
       <w:pPr>
@@ -597,11 +569,10 @@
         <w:ind w:left="340" w:right="340"/>
       </w:pPr>
       <w:r>
-        <w:t xml:space="preserve">6.4 Prediction bias under strict transfer </w:t>
+        <w:t xml:space="preserve">5.4 Prediction bias under strict transfer </w:t>
         <w:tab/>
-        <w:t>31</w:t>
-      </w:r>
-      <w:r/>
+        <w:t>34</w:t>
+      </w:r>
     </w:p>
     <w:p>
       <w:pPr>
@@ -613,15 +584,15 @@
       <w:r>
         <w:t>A.1 Reproducible experiment file structure and output artifacts</w:t>
         <w:tab/>
-        <w:t>51</w:t>
-      </w:r>
-      <w:r/>
+        <w:t>54</w:t>
+      </w:r>
     </w:p>
     <w:p>
       <w:pPr>
         <w:spacing w:before="1600" w:after="1560"/>
         <w:jc w:val="center"/>
       </w:pPr>
+      <w:r/>
     </w:p>
     <w:p>
       <w:pPr>
@@ -646,7 +617,6 @@
         <w:tab/>
         <w:t>2</w:t>
       </w:r>
-      <w:r/>
     </w:p>
     <w:p>
       <w:pPr>
@@ -658,9 +628,8 @@
       <w:r>
         <w:t>3.1 Experiment map</w:t>
         <w:tab/>
-        <w:t>10</w:t>
-      </w:r>
-      <w:r/>
+        <w:t>11</w:t>
+      </w:r>
     </w:p>
     <w:p>
       <w:pPr>
@@ -672,9 +641,8 @@
       <w:r>
         <w:t>3.2 Dataset splits and label distributions for LIAR and FakeNewsNet</w:t>
         <w:tab/>
-        <w:t>11</w:t>
-      </w:r>
-      <w:r/>
+        <w:t>12</w:t>
+      </w:r>
     </w:p>
     <w:p>
       <w:pPr>
@@ -686,9 +654,8 @@
       <w:r>
         <w:t>3.3 Binary label mapping</w:t>
         <w:tab/>
-        <w:t>12</w:t>
-      </w:r>
-      <w:r/>
+        <w:t>13</w:t>
+      </w:r>
     </w:p>
     <w:p>
       <w:pPr>
@@ -700,9 +667,8 @@
       <w:r>
         <w:t>3.4 Baseline models</w:t>
         <w:tab/>
-        <w:t>12</w:t>
-      </w:r>
-      <w:r/>
+        <w:t>13</w:t>
+      </w:r>
     </w:p>
     <w:p>
       <w:pPr>
@@ -714,9 +680,8 @@
       <w:r>
         <w:t>3.5 Main transformer hyperparameter settings</w:t>
         <w:tab/>
-        <w:t>13</w:t>
-      </w:r>
-      <w:r/>
+        <w:t>14</w:t>
+      </w:r>
     </w:p>
     <w:p>
       <w:pPr>
@@ -728,9 +693,8 @@
       <w:r>
         <w:t>4.1 Main LIAR results</w:t>
         <w:tab/>
-        <w:t>16</w:t>
-      </w:r>
-      <w:r/>
+        <w:t>18</w:t>
+      </w:r>
     </w:p>
     <w:p>
       <w:pPr>
@@ -742,9 +706,8 @@
       <w:r>
         <w:t>4.2 Class-level recall for local models with saved recall metrics</w:t>
         <w:tab/>
-        <w:t>18</w:t>
-      </w:r>
-      <w:r/>
+        <w:t>20</w:t>
+      </w:r>
     </w:p>
     <w:p>
       <w:pPr>
@@ -754,11 +717,10 @@
         <w:ind w:left="340" w:right="340"/>
       </w:pPr>
       <w:r>
-        <w:t>5.1 Representative LIAR error cases discussed in the main text</w:t>
+        <w:t>4.3 Representative LIAR error cases discussed in the main text</w:t>
         <w:tab/>
-        <w:t>23</w:t>
-      </w:r>
-      <w:r/>
+        <w:t>24</w:t>
+      </w:r>
     </w:p>
     <w:p>
       <w:pPr>
@@ -768,11 +730,10 @@
         <w:ind w:left="340" w:right="340"/>
       </w:pPr>
       <w:r>
-        <w:t>6.1 LIAR in-domain comparison before transfer</w:t>
+        <w:t>5.1 LIAR in-domain comparison before transfer</w:t>
         <w:tab/>
-        <w:t>26</w:t>
-      </w:r>
-      <w:r/>
+        <w:t>28</w:t>
+      </w:r>
     </w:p>
     <w:p>
       <w:pPr>
@@ -782,11 +743,10 @@
         <w:ind w:left="340" w:right="340"/>
       </w:pPr>
       <w:r>
-        <w:t>6.2 LIAR-to-FakeNewsNet title transfer results</w:t>
+        <w:t>5.2 LIAR-to-FakeNewsNet title transfer results</w:t>
         <w:tab/>
-        <w:t>26</w:t>
-      </w:r>
-      <w:r/>
+        <w:t>28</w:t>
+      </w:r>
     </w:p>
     <w:p>
       <w:pPr>
@@ -796,11 +756,10 @@
         <w:ind w:left="340" w:right="340"/>
       </w:pPr>
       <w:r>
-        <w:t>6.3 Majority-class (always-REAL) reference baseline on FakeNewsNet minimal titles</w:t>
+        <w:t>5.3 Majority-class (always-REAL) reference baseline on FakeNewsNet minimal titles</w:t>
         <w:tab/>
-        <w:t>26</w:t>
-      </w:r>
-      <w:r/>
+        <w:t>29</w:t>
+      </w:r>
     </w:p>
     <w:p>
       <w:pPr>
@@ -810,11 +769,10 @@
         <w:ind w:left="340" w:right="340"/>
       </w:pPr>
       <w:r>
-        <w:t>6.4 Within-FakeNewsNet subpart transfer (TF-IDF and weighted RoBERTa)</w:t>
+        <w:t>5.4 Within-FakeNewsNet subpart transfer (TF-IDF and weighted RoBERTa)</w:t>
         <w:tab/>
-        <w:t>29</w:t>
-      </w:r>
-      <w:r/>
+        <w:t>32</w:t>
+      </w:r>
     </w:p>
     <w:p>
       <w:pPr>
@@ -824,11 +782,10 @@
         <w:ind w:left="340" w:right="340"/>
       </w:pPr>
       <w:r>
-        <w:t>6.5 Integrated comparison of in-domain, direct transfer, intermediate fine-tuning, and TELLER-like pilot results</w:t>
+        <w:t>5.5 Integrated comparison of in-domain, direct transfer, intermediate fine-tuning, and TELLER-like pilot results</w:t>
         <w:tab/>
-        <w:t>33</w:t>
-      </w:r>
-      <w:r/>
+        <w:t>36</w:t>
+      </w:r>
     </w:p>
     <w:p>
       <w:pPr>
@@ -838,11 +795,10 @@
         <w:ind w:left="340" w:right="340"/>
       </w:pPr>
       <w:r>
-        <w:t>7.1 This dissertation's transfer results compared with prior cross-domain fake-news work</w:t>
+        <w:t>6.1 This dissertation's transfer results compared with prior cross-domain fake-news work</w:t>
         <w:tab/>
-        <w:t>37</w:t>
-      </w:r>
-      <w:r/>
+        <w:t>40</w:t>
+      </w:r>
     </w:p>
     <w:p>
       <w:pPr>
@@ -854,9 +810,8 @@
       <w:r>
         <w:t>A.1 Classification metric summaries used in the dissertation</w:t>
         <w:tab/>
-        <w:t>48</w:t>
-      </w:r>
-      <w:r/>
+        <w:t>51</w:t>
+      </w:r>
     </w:p>
     <w:p>
       <w:pPr>
@@ -868,9 +823,8 @@
       <w:r>
         <w:t>B.1 Available confusion matrices and matrix sources</w:t>
         <w:tab/>
-        <w:t>49</w:t>
-      </w:r>
-      <w:r/>
+        <w:t>52</w:t>
+      </w:r>
     </w:p>
     <w:p>
       <w:pPr>
@@ -882,9 +836,8 @@
       <w:r>
         <w:t>C.1 Reproducible hyperparameter settings</w:t>
         <w:tab/>
-        <w:t>49</w:t>
-      </w:r>
-      <w:r/>
+        <w:t>52</w:t>
+      </w:r>
     </w:p>
     <w:p>
       <w:pPr>
@@ -896,9 +849,8 @@
       <w:r>
         <w:t>D.1 Representative LIAR error-analysis examples</w:t>
         <w:tab/>
-        <w:t>50</w:t>
-      </w:r>
-      <w:r/>
+        <w:t>53</w:t>
+      </w:r>
     </w:p>
     <w:p>
       <w:pPr>
@@ -912,9 +864,11 @@
           <w:docGrid w:linePitch="360"/>
         </w:sectPr>
       </w:pPr>
-    </w:p>
-    <w:p>
-      <w:pPr>
+      <w:r/>
+    </w:p>
+    <w:p>
+      <w:pPr>
+        <w:pageBreakBefore/>
         <w:spacing w:before="720" w:after="360"/>
       </w:pPr>
       <w:r>
@@ -1131,7 +1085,6 @@
             <w:r>
               <w:rPr>
                 <w:b/>
-                <w:sz w:val="18"/>
               </w:rPr>
               <w:t>ID</w:t>
             </w:r>
@@ -1160,7 +1113,6 @@
             <w:r>
               <w:rPr>
                 <w:b/>
-                <w:sz w:val="18"/>
               </w:rPr>
               <w:t>Research question</w:t>
             </w:r>
@@ -1189,9 +1141,8 @@
             <w:r>
               <w:rPr>
                 <w:b/>
-                <w:sz w:val="18"/>
-              </w:rPr>
-              <w:t>Purpose</w:t>
+              </w:rPr>
+              <w:t>Addressed in</w:t>
             </w:r>
           </w:p>
         </w:tc>
@@ -1219,8 +1170,7 @@
             </w:pPr>
             <w:r>
               <w:rPr>
-                <w:b/>
-                <w:sz w:val="18"/>
+                <w:b w:val="0"/>
               </w:rPr>
               <w:t>RQ1</w:t>
             </w:r>
@@ -1248,9 +1198,9 @@
             </w:pPr>
             <w:r>
               <w:rPr>
-                <w:sz w:val="18"/>
-              </w:rPr>
-              <w:t>How well do traditional and transformer-based classifiers perform on LIAR binary fake news detection?</w:t>
+                <w:b w:val="0"/>
+              </w:rPr>
+              <w:t>Does class-weighted training change the balance between overall performance (Macro-F1) and FAKE recall?</w:t>
             </w:r>
           </w:p>
         </w:tc>
@@ -1276,9 +1226,9 @@
             </w:pPr>
             <w:r>
               <w:rPr>
-                <w:sz w:val="18"/>
-              </w:rPr>
-              <w:t>Establish reliable in-domain baselines.</w:t>
+                <w:b w:val="0"/>
+              </w:rPr>
+              <w:t>Chapter 4</w:t>
             </w:r>
           </w:p>
         </w:tc>
@@ -1306,8 +1256,7 @@
             </w:pPr>
             <w:r>
               <w:rPr>
-                <w:b/>
-                <w:sz w:val="18"/>
+                <w:b w:val="0"/>
               </w:rPr>
               <w:t>RQ2</w:t>
             </w:r>
@@ -1335,9 +1284,9 @@
             </w:pPr>
             <w:r>
               <w:rPr>
-                <w:sz w:val="18"/>
-              </w:rPr>
-              <w:t>Does class-weighted training improve Macro-F1 or FAKE recall?</w:t>
+                <w:b w:val="0"/>
+              </w:rPr>
+              <w:t>What kinds of inputs does the best local model still misclassify, and what does this say about statement-only detection?</w:t>
             </w:r>
           </w:p>
         </w:tc>
@@ -1363,9 +1312,9 @@
             </w:pPr>
             <w:r>
               <w:rPr>
-                <w:sz w:val="18"/>
-              </w:rPr>
-              <w:t>Study class-sensitive model behaviour.</w:t>
+                <w:b w:val="0"/>
+              </w:rPr>
+              <w:t>Chapter 4</w:t>
             </w:r>
           </w:p>
         </w:tc>
@@ -1393,8 +1342,7 @@
             </w:pPr>
             <w:r>
               <w:rPr>
-                <w:b/>
-                <w:sz w:val="18"/>
+                <w:b w:val="0"/>
               </w:rPr>
               <w:t>RQ3</w:t>
             </w:r>
@@ -1419,9 +1367,9 @@
           <w:p>
             <w:r>
               <w:rPr>
-                <w:sz w:val="16"/>
-              </w:rPr>
-              <w:t>What kinds of LIAR test items are most often misclassified by the best-performing local model, and do these patterns suggest limits of statement-only modelling?</w:t>
+                <w:b w:val="0"/>
+              </w:rPr>
+              <w:t>To what extent do LIAR-trained classifiers remain reliable on FakeNewsNet titles without adaptation, compared with trivial baselines?</w:t>
             </w:r>
           </w:p>
         </w:tc>
@@ -1444,9 +1392,9 @@
           <w:p>
             <w:r>
               <w:rPr>
-                <w:sz w:val="16"/>
-              </w:rPr>
-              <w:t>Understand model limitations beyond aggregate scores.</w:t>
+                <w:b w:val="0"/>
+              </w:rPr>
+              <w:t>Chapter 5</w:t>
             </w:r>
           </w:p>
         </w:tc>
@@ -1474,8 +1422,7 @@
             </w:pPr>
             <w:r>
               <w:rPr>
-                <w:b/>
-                <w:sz w:val="18"/>
+                <w:b w:val="0"/>
               </w:rPr>
               <w:t>RQ4</w:t>
             </w:r>
@@ -1500,9 +1447,9 @@
           <w:p>
             <w:r>
               <w:rPr>
-                <w:sz w:val="16"/>
-              </w:rPr>
-              <w:t>To what extent are LIAR-trained local baselines directly comparable with LLM-based frameworks such as TELLER, given differences in system design?</w:t>
+                <w:b w:val="0"/>
+              </w:rPr>
+              <w:t>How much labelled target-domain data does intermediate fine-tuning need to recover the transfer failure?</w:t>
             </w:r>
           </w:p>
         </w:tc>
@@ -1525,96 +1472,9 @@
           <w:p>
             <w:r>
               <w:rPr>
-                <w:sz w:val="16"/>
-              </w:rPr>
-              <w:t>Avoid presenting LLM-based frameworks and locally fine-tuned classifiers as if they were directly comparable systems.</w:t>
-            </w:r>
-          </w:p>
-        </w:tc>
-      </w:tr>
-      <w:tr>
-        <w:tc>
-          <w:tcPr>
-            <w:tcW w:w="797" w:type="dxa"/>
-            <w:tcBorders>
-              <w:top w:val="single" w:sz="4" w:space="0" w:color="000000"/>
-              <w:left w:val="single" w:sz="4" w:space="0" w:color="000000"/>
-              <w:bottom w:val="single" w:sz="4" w:space="0" w:color="000000"/>
-              <w:right w:val="single" w:sz="4" w:space="0" w:color="000000"/>
-            </w:tcBorders>
-            <w:tcMar>
-              <w:top w:w="80" w:type="dxa"/>
-              <w:left w:w="80" w:type="dxa"/>
-              <w:bottom w:w="80" w:type="dxa"/>
-              <w:right w:w="80" w:type="dxa"/>
-            </w:tcMar>
-          </w:tcPr>
-          <w:p>
-            <w:pPr>
-              <w:spacing w:after="0" w:line="240" w:lineRule="auto"/>
-            </w:pPr>
-            <w:r>
-              <w:rPr>
-                <w:b/>
-                <w:sz w:val="18"/>
-              </w:rPr>
-              <w:t>RQ5</w:t>
-            </w:r>
-          </w:p>
-        </w:tc>
-        <w:tc>
-          <w:tcPr>
-            <w:tcW w:w="4518" w:type="dxa"/>
-            <w:tcBorders>
-              <w:top w:val="single" w:sz="4" w:space="0" w:color="000000"/>
-              <w:left w:val="single" w:sz="4" w:space="0" w:color="000000"/>
-              <w:bottom w:val="single" w:sz="4" w:space="0" w:color="000000"/>
-              <w:right w:val="single" w:sz="4" w:space="0" w:color="000000"/>
-            </w:tcBorders>
-            <w:tcMar>
-              <w:top w:w="80" w:type="dxa"/>
-              <w:left w:w="80" w:type="dxa"/>
-              <w:bottom w:w="80" w:type="dxa"/>
-              <w:right w:w="80" w:type="dxa"/>
-            </w:tcMar>
-          </w:tcPr>
-          <w:p>
-            <w:pPr>
-              <w:spacing w:after="0" w:line="240" w:lineRule="auto"/>
-            </w:pPr>
-            <w:r>
-              <w:rPr>
-                <w:sz w:val="18"/>
-              </w:rPr>
-              <w:t>How well do LIAR-trained baselines transfer to FakeNewsNet minimal titles?</w:t>
-            </w:r>
-          </w:p>
-        </w:tc>
-        <w:tc>
-          <w:tcPr>
-            <w:tcW w:w="3189" w:type="dxa"/>
-            <w:tcBorders>
-              <w:top w:val="single" w:sz="4" w:space="0" w:color="000000"/>
-              <w:left w:val="single" w:sz="4" w:space="0" w:color="000000"/>
-              <w:bottom w:val="single" w:sz="4" w:space="0" w:color="000000"/>
-              <w:right w:val="single" w:sz="4" w:space="0" w:color="000000"/>
-            </w:tcBorders>
-            <w:tcMar>
-              <w:top w:w="80" w:type="dxa"/>
-              <w:left w:w="80" w:type="dxa"/>
-              <w:bottom w:w="80" w:type="dxa"/>
-              <w:right w:w="80" w:type="dxa"/>
-            </w:tcMar>
-          </w:tcPr>
-          <w:p>
-            <w:pPr>
-              <w:spacing w:after="0" w:line="240" w:lineRule="auto"/>
-            </w:pPr>
-            <w:r>
-              <w:rPr>
-                <w:sz w:val="18"/>
-              </w:rPr>
-              <w:t>Measure cross-dataset reliability directly.</w:t>
+                <w:b w:val="0"/>
+              </w:rPr>
+              <w:t>Chapter 5</w:t>
             </w:r>
           </w:p>
         </w:tc>
@@ -1706,7 +1566,7 @@
         <w:jc w:val="both"/>
       </w:pPr>
       <w:r>
-        <w:t>Chapter 2 summarises datasets, traditional and transformer-based fake news detection, LLM-based reasoning systems, class imbalance, robustness, and cross-dataset generalisation. Chapter 3 describes the dataset preparation, TF-IDF/BERT/RoBERTa model setups, training setup, and evaluation protocol. Chapter 4 reports the LIAR in-domain experiments. Chapter 5 presents error analysis and preliminary checks on context input and decision-threshold tuning. Chapter 6 reports the strict LIAR-to-FakeNewsNet title transfer evaluation, intermediate target-domain fine-tuning, and a simplified TELLER-like reasoning-atom pilot. Chapter 7 discusses findings and limitations. Chapter 8 concludes the dissertation.</w:t>
+        <w:t>Chapter 2 summarises datasets, traditional and transformer-based fake news detection, LLM-based reasoning systems, class imbalance, robustness, and cross-dataset generalisation. Chapter 3 describes the dataset preparation, TF-IDF/BERT/RoBERTa model setups, training setup, and evaluation protocol. Chapter 4 reports the LIAR in-domain experiments and incorporates the error analysis and preliminary checks. Chapter 5 reports the strict LIAR-to-FakeNewsNet title transfer evaluation, intermediate target-domain fine-tuning, and a simplified TELLER-like reasoning-atom pilot. Chapter 6 discusses findings and limitations. Chapter 7 concludes the dissertation.</w:t>
       </w:r>
     </w:p>
     <w:p>
@@ -1715,7 +1575,9 @@
       </w:r>
     </w:p>
     <w:p>
-      <w:pPr/>
+      <w:pPr>
+        <w:pageBreakBefore/>
+      </w:pPr>
       <w:r>
         <w:rPr>
           <w:b/>
@@ -1969,7 +1831,7 @@
     <w:p>
       <w:pPr/>
       <w:r>
-        <w:t>The review shows real progress: large benchmarks exist [1, 2, 3]; transformers improved in-domain performance [6, 7]; LLM/reasoning systems push accuracy and explainability further [9, 10]; and the role of class imbalance and metric choice is understood [13]. Cross-domain fake-news detection is also actively studied [16, 17, 18, 19, 20, 21, 22], so the gap is not that nobody studies transfer. The gap is narrower and methodological:</w:t>
+        <w:t>The review shows clear progress in fake news detection research: large benchmarks exist [1, 2, 3]; transformers improved in-domain performance [6, 7]; LLM/reasoning systems push accuracy and explainability further [9, 10]; and the role of class imbalance and metric choice is understood [13]. However, four gaps remain for this dissertation:</w:t>
       </w:r>
     </w:p>
     <w:p>
@@ -2003,7 +1865,9 @@
       </w:r>
     </w:p>
     <w:p>
-      <w:pPr/>
+      <w:pPr>
+        <w:pageBreakBefore/>
+      </w:pPr>
       <w:r>
         <w:rPr>
           <w:b/>
@@ -4081,6 +3945,7 @@
     </w:p>
     <w:p>
       <w:pPr>
+        <w:pageBreakBefore/>
         <w:spacing w:before="720" w:after="360"/>
       </w:pPr>
       <w:r>
@@ -4097,11 +3962,7 @@
         <w:spacing w:after="480"/>
       </w:pPr>
       <w:r>
-        <w:rPr>
-          <w:b/>
-          <w:sz w:val="48"/>
-        </w:rPr>
-        <w:t>LIAR In-Domain Experiments</w:t>
+        <w:t>LIAR In-Domain Experiments and Error Analysis</w:t>
       </w:r>
     </w:p>
     <w:p>
@@ -4421,7 +4282,7 @@
             </w:pPr>
             <w:r>
               <w:rPr>
-                <w:sz w:val="21"/>
+                <w:b w:val="0"/>
               </w:rPr>
               <w:t>0.6235</w:t>
             </w:r>
@@ -4452,7 +4313,7 @@
             </w:pPr>
             <w:r>
               <w:rPr>
-                <w:sz w:val="21"/>
+                <w:b w:val="0"/>
               </w:rPr>
               <w:t>0.6005</w:t>
             </w:r>
@@ -4582,7 +4443,8 @@
             </w:pPr>
             <w:r>
               <w:rPr>
-                <w:sz w:val="21"/>
+                <w:b w:val="0"/>
+                <w:u w:val="single"/>
               </w:rPr>
               <w:t>0.6425 +/- 0.0095</w:t>
             </w:r>
@@ -4613,7 +4475,7 @@
             </w:pPr>
             <w:r>
               <w:rPr>
-                <w:sz w:val="21"/>
+                <w:b w:val="0"/>
               </w:rPr>
               <w:t>0.6231 +/- 0.0122</w:t>
             </w:r>
@@ -4743,7 +4605,7 @@
             </w:pPr>
             <w:r>
               <w:rPr>
-                <w:sz w:val="21"/>
+                <w:b w:val="0"/>
               </w:rPr>
               <w:t>0.6412 +/- 0.0065</w:t>
             </w:r>
@@ -4774,7 +4636,8 @@
             </w:pPr>
             <w:r>
               <w:rPr>
-                <w:sz w:val="21"/>
+                <w:b w:val="0"/>
+                <w:u w:val="single"/>
               </w:rPr>
               <w:t>0.6322 +/- 0.0090</w:t>
             </w:r>
@@ -4904,7 +4767,7 @@
             </w:pPr>
             <w:r>
               <w:rPr>
-                <w:sz w:val="21"/>
+                <w:b/>
               </w:rPr>
               <w:t>0.6522 +/- 0.0074</w:t>
             </w:r>
@@ -4935,7 +4798,7 @@
             </w:pPr>
             <w:r>
               <w:rPr>
-                <w:sz w:val="21"/>
+                <w:b/>
               </w:rPr>
               <w:t>0.6396 +/- 0.0080</w:t>
             </w:r>
@@ -5135,6 +4998,11 @@
         </w:tc>
       </w:tr>
     </w:tbl>
+    <w:p>
+      <w:r>
+        <w:t>Note. Bold marks the best comparable local value within a column; underlining marks the second-best. Five-seed paired t-tests on Macro-F1 do not show p &lt; .05 differences among the local transformer rows (weighted RoBERTa vs weighted BERT: p = 0.1765). TELLER is a published framework result and is not ranked as a local baseline.</w:t>
+      </w:r>
+    </w:p>
     <w:p/>
     <w:p>
       <w:r>
@@ -5347,7 +5215,7 @@
             </w:pPr>
             <w:r>
               <w:rPr>
-                <w:sz w:val="18"/>
+                <w:b/>
               </w:rPr>
               <w:t>0.7661</w:t>
             </w:r>
@@ -5375,7 +5243,7 @@
             </w:pPr>
             <w:r>
               <w:rPr>
-                <w:sz w:val="18"/>
+                <w:b w:val="0"/>
               </w:rPr>
               <w:t>0.4394</w:t>
             </w:r>
@@ -5462,7 +5330,7 @@
             </w:pPr>
             <w:r>
               <w:rPr>
-                <w:sz w:val="18"/>
+                <w:b w:val="0"/>
               </w:rPr>
               <w:t>0.7048 +/- 0.0292</w:t>
             </w:r>
@@ -5490,7 +5358,7 @@
             </w:pPr>
             <w:r>
               <w:rPr>
-                <w:sz w:val="18"/>
+                <w:b/>
               </w:rPr>
               <w:t>0.5591 +/- 0.0447</w:t>
             </w:r>
@@ -5577,7 +5445,8 @@
             </w:pPr>
             <w:r>
               <w:rPr>
-                <w:sz w:val="18"/>
+                <w:b w:val="0"/>
+                <w:u w:val="single"/>
               </w:rPr>
               <w:t>0.7443 +/- 0.0153</w:t>
             </w:r>
@@ -5605,7 +5474,8 @@
             </w:pPr>
             <w:r>
               <w:rPr>
-                <w:sz w:val="18"/>
+                <w:b w:val="0"/>
+                <w:u w:val="single"/>
               </w:rPr>
               <w:t>0.5335 +/- 0.0199</w:t>
             </w:r>
@@ -5641,6 +5511,11 @@
         </w:tc>
       </w:tr>
     </w:tbl>
+    <w:p>
+      <w:r>
+        <w:t>Note. Bold marks the best comparable value within a column; underlining marks the second-best. Statistical significance is not shown for deterministic, single-seed, or non-comparable literature rows.</w:t>
+      </w:r>
+    </w:p>
     <w:p/>
     <w:p>
       <w:pPr>
@@ -5819,35 +5694,10 @@
     </w:p>
     <w:p>
       <w:pPr>
-        <w:spacing w:before="720" w:after="360"/>
-      </w:pPr>
-      <w:r>
-        <w:rPr>
-          <w:b/>
-          <w:sz w:val="48"/>
-        </w:rPr>
-        <w:lastRenderedPageBreak/>
-        <w:t>Chapter 5</w:t>
-      </w:r>
-    </w:p>
-    <w:p>
-      <w:pPr>
-        <w:spacing w:after="480"/>
-      </w:pPr>
-      <w:r>
-        <w:rPr>
-          <w:b/>
-          <w:sz w:val="48"/>
-        </w:rPr>
-        <w:t>Error Analysis and Further Experiments</w:t>
-      </w:r>
-    </w:p>
-    <w:p>
-      <w:pPr>
         <w:pStyle w:val="21"/>
       </w:pPr>
       <w:r>
-        <w:t>5.1 Motivation</w:t>
+        <w:t>4.7 Error Analysis</w:t>
       </w:r>
     </w:p>
     <w:p>
@@ -5860,10 +5710,10 @@
     </w:p>
     <w:p>
       <w:pPr>
-        <w:pStyle w:val="21"/>
-      </w:pPr>
-      <w:r>
-        <w:t>5.2 Main Error Patterns</w:t>
+        <w:pStyle w:val="31"/>
+      </w:pPr>
+      <w:r>
+        <w:t>4.7.1 Main Error Patterns</w:t>
       </w:r>
     </w:p>
     <w:p>
@@ -5962,10 +5812,26 @@
     </w:p>
     <w:p>
       <w:pPr>
+        <w:pStyle w:val="31"/>
+      </w:pPr>
+      <w:r>
+        <w:t>4.7.2 Weighted BERT and Weighted RoBERTa Trade-off</w:t>
+      </w:r>
+    </w:p>
+    <w:p>
+      <w:pPr>
+        <w:jc w:val="both"/>
+      </w:pPr>
+      <w:r>
+        <w:t>Weighted RoBERTa achieves higher overall Macro-F1, while weighted BERT produces stronger FAKE recall. Neither model dominates across both metrics, which is precisely why reporting class-level recall alongside Macro-F1 matters. A practitioner who prioritises catching more fake examples would prefer weighted BERT; one who prioritises overall balanced performance would prefer weighted RoBERTa. Accuracy alone would obscure this distinction entirely.</w:t>
+      </w:r>
+    </w:p>
+    <w:p>
+      <w:pPr>
         <w:pStyle w:val="21"/>
       </w:pPr>
       <w:r>
-        <w:t>5.3 Weighted BERT and Weighted RoBERTa Trade-off</w:t>
+        <w:t>4.8 Preliminary Context and Threshold Checks</w:t>
       </w:r>
     </w:p>
     <w:p>
@@ -5973,7 +5839,23 @@
         <w:jc w:val="both"/>
       </w:pPr>
       <w:r>
-        <w:t>Weighted RoBERTa achieves higher overall Macro-F1, while weighted BERT produces stronger FAKE recall. Neither model dominates across both metrics, which is precisely why reporting class-level recall alongside Macro-F1 matters. A practitioner who prioritises catching more fake examples would prefer weighted BERT; one who prioritises overall balanced performance would prefer weighted RoBERTa. Accuracy alone would obscure this distinction entirely.</w:t>
+        <w:t>A preliminary check was carried out for weighted RoBERTa by comparing statement-only input with a simple concatenation of statement and available context. Exact metrics for this check are not retained in the result files reported in this dissertation, so the check is reported here as a small exploratory comparison rather than a full controlled experiment. The observed pattern was that simple context concatenation did not yield a visible improvement over statement-only input, which suggests that context, if useful, may need a more structured integration method than direct concatenation. A future-work item is to repeat this check with logged metrics so that the comparison can be reported quantitatively.</w:t>
+      </w:r>
+    </w:p>
+    <w:p>
+      <w:pPr>
+        <w:pStyle w:val="31"/>
+      </w:pPr>
+      <w:r>
+        <w:t>4.8.1 Preliminary Threshold Check</w:t>
+      </w:r>
+    </w:p>
+    <w:p>
+      <w:pPr>
+        <w:jc w:val="both"/>
+      </w:pPr>
+      <w:r>
+        <w:t>A preliminary check was also carried out for weighted RoBERTa using a validation-tuned decision threshold rather than the default 0.5 cut-off. Exact tuned thresholds and the corresponding test-set metrics are not retained in the result files reported in this dissertation, so this check is reported as an exploratory probe rather than as a fully tabulated experiment. The qualitative observation was that the tuned setting redistributed errors between the REAL and FAKE classes - REAL recall went up while FAKE recall went down - without a clear net improvement in Macro-F1. A future-work item is to rerun threshold tuning with logged per-threshold metrics so that the trade-off can be presented as a small table.</w:t>
       </w:r>
     </w:p>
     <w:p>
@@ -5981,7 +5863,7 @@
         <w:pStyle w:val="21"/>
       </w:pPr>
       <w:r>
-        <w:t>5.4 Preliminary Context Check</w:t>
+        <w:t>4.9 Representative Cases and Summary</w:t>
       </w:r>
     </w:p>
     <w:p>
@@ -5989,40 +5871,7 @@
         <w:jc w:val="both"/>
       </w:pPr>
       <w:r>
-        <w:t>A preliminary check was carried out for weighted RoBERTa by comparing statement-only input with a simple concatenation of statement and available context. Exact metrics for this check are not retained in the result files reported in this dissertation, so the check is reported here as a small exploratory comparison rather than a full controlled experiment. The observed pattern was that simple context concatenation did not yield a visible improvement over statement-only input, which suggests that context, if useful, may need a more structured integration method than direct concatenation. A future-work item is to repeat this check with logged metrics so that the comparison can be reported quantitatively.</w:t>
-      </w:r>
-    </w:p>
-    <w:p>
-      <w:pPr>
-        <w:pStyle w:val="21"/>
-      </w:pPr>
-      <w:r>
-        <w:lastRenderedPageBreak/>
-        <w:t>5.5 Preliminary Threshold Check</w:t>
-      </w:r>
-    </w:p>
-    <w:p>
-      <w:pPr>
-        <w:jc w:val="both"/>
-      </w:pPr>
-      <w:r>
-        <w:t>A preliminary check was also carried out for weighted RoBERTa using a validation-tuned decision threshold rather than the default 0.5 cut-off. Exact tuned thresholds and the corresponding test-set metrics are not retained in the result files reported in this dissertation, so this check is reported as an exploratory probe rather than as a fully tabulated experiment. The qualitative observation was that the tuned setting redistributed errors between the REAL and FAKE classes - REAL recall went up while FAKE recall went down - without a clear net improvement in Macro-F1. A future-work item is to rerun threshold tuning with logged per-threshold metrics so that the trade-off can be presented as a small table.</w:t>
-      </w:r>
-    </w:p>
-    <w:p>
-      <w:pPr>
-        <w:pStyle w:val="21"/>
-      </w:pPr>
-      <w:r>
-        <w:t>5.6 Representative Error Cases</w:t>
-      </w:r>
-    </w:p>
-    <w:p>
-      <w:pPr>
-        <w:jc w:val="both"/>
-      </w:pPr>
-      <w:r>
-        <w:t>A small number of representative test-set errors are useful in the main text because they make the aggregate error patterns more concrete. The full set of saved examples remains in Appendix D, while Table 5.1 highlights three typical cases.</w:t>
+        <w:t>A small number of representative test-set errors are useful in the main text because they make the aggregate error patterns more concrete. The full set of saved examples remains in Appendix D, while Table 4.3 highlights three typical cases.</w:t>
       </w:r>
     </w:p>
     <w:p>
@@ -6032,11 +5881,7 @@
         <w:jc w:val="center"/>
       </w:pPr>
       <w:r>
-        <w:rPr>
-          <w:i/>
-          <w:sz w:val="20"/>
-        </w:rPr>
-        <w:t>Table 5.1. Representative LIAR error cases discussed in the main text.</w:t>
+        <w:t>Table 4.3. Representative LIAR error cases discussed in the main text.</w:t>
       </w:r>
     </w:p>
     <w:tbl>
@@ -6649,12 +6494,59 @@
     </w:p>
     <w:p>
       <w:pPr>
+        <w:pStyle w:val="31"/>
+        <w:pageBreakBefore/>
+      </w:pPr>
+      <w:r>
+        <w:t>4.9.1 Summary against RQ2</w:t>
+      </w:r>
+    </w:p>
+    <w:p>
+      <w:pPr>
+        <w:jc w:val="both"/>
+      </w:pPr>
+      <w:r>
+        <w:t>Overall, the error analysis shows that the remaining mistakes are not random. They are concentrated in numeric claims, label-boundary ambiguity, and context-dependent statements. This supports the later cross-dataset evaluation, because these errors suggest that statement text alone often lacks enough evidence for reliable fake news detection.</w:t>
+      </w:r>
+    </w:p>
+    <w:p>
+      <w:pPr>
+        <w:jc w:val="both"/>
+      </w:pPr>
+      <w:r>
+        <w:t>The preliminary checks in Sections 4.8 and 4.8.1 also suggest that simple fixes are not enough. Adding context by concatenation and tuning the prediction threshold did not clearly resolve the remaining problem. The next evaluation therefore asks a sharper question: whether the models can transfer beyond LIAR at all.</w:t>
+      </w:r>
+    </w:p>
+    <w:p>
+      <w:pPr>
+        <w:pageBreakBefore/>
+      </w:pPr>
+      <w:r>
+        <w:t>Chapter 5</w:t>
+      </w:r>
+    </w:p>
+    <w:p>
+      <w:pPr>
+        <w:spacing w:after="480"/>
+      </w:pPr>
+      <w:r>
+        <w:t>Cross-Dataset Evaluation</w:t>
+      </w:r>
+    </w:p>
+    <w:p>
+      <w:pPr>
+        <w:jc w:val="both"/>
+      </w:pPr>
+      <w:r>
+        <w:t>This chapter first reports the strict cross-dataset evaluation, where models are trained on LIAR and tested directly on FakeNewsNet minimal titles. It then extends the analysis with intermediate target-domain fine-tuning on FakeNewsNet train subsets and a simplified TELLER-like reasoning-atom pilot. The strict direct-transfer setting uses no FakeNewsNet examples for training, validation, threshold selection, or model selection; the adaptation setting uses only FakeNewsNet train/validation subsets and keeps a held-out FakeNewsNet test split for final evaluation.</w:t>
+      </w:r>
+    </w:p>
+    <w:p>
+      <w:pPr>
         <w:pStyle w:val="21"/>
-        <w:pageBreakBefore/>
-      </w:pPr>
-      <w:r>
-        <w:lastRenderedPageBreak/>
-        <w:t>5.7 Summary against RQ3</w:t>
+      </w:pPr>
+      <w:r>
+        <w:t>5.1 Motivation</w:t>
       </w:r>
     </w:p>
     <w:p>
@@ -6662,7 +6554,15 @@
         <w:jc w:val="both"/>
       </w:pPr>
       <w:r>
-        <w:t>Overall, the error analysis shows that the remaining mistakes are not random. They are concentrated in numeric claims, label-boundary ambiguity, and context-dependent statements. This supports the later cross-dataset evaluation, because these errors suggest that statement text alone often lacks enough evidence for reliable fake news detection.</w:t>
+        <w:t>In-domain LIAR performance is not enough to show that a fake news detector is reliable. A model may learn dataset-specific language patterns rather than general veracity signals. Cross-dataset evaluation is therefore needed to test whether the model transfers to a different source or domain.</w:t>
+      </w:r>
+    </w:p>
+    <w:p>
+      <w:pPr>
+        <w:pStyle w:val="21"/>
+      </w:pPr>
+      <w:r>
+        <w:t>5.2 Target Dataset</w:t>
       </w:r>
     </w:p>
     <w:p>
@@ -6670,37 +6570,15 @@
         <w:jc w:val="both"/>
       </w:pPr>
       <w:r>
-        <w:t>The preliminary checks in Sections 5.4 and 5.5 also suggest that simple fixes are not enough. Adding context by concatenation and tuning the prediction threshold did not clearly resolve the remaining problem. The next evaluation therefore asks a sharper question: whether the models can transfer beyond LIAR at all.</w:t>
-      </w:r>
-    </w:p>
-    <w:p>
-      <w:r>
-        <w:br w:type="page"/>
-      </w:r>
-    </w:p>
-    <w:p>
-      <w:pPr>
-        <w:spacing w:before="720" w:after="360"/>
-      </w:pPr>
-      <w:r>
-        <w:rPr>
-          <w:b/>
-          <w:sz w:val="48"/>
-        </w:rPr>
-        <w:lastRenderedPageBreak/>
-        <w:t>Chapter 6</w:t>
-      </w:r>
-    </w:p>
-    <w:p>
-      <w:pPr>
-        <w:spacing w:after="480"/>
-      </w:pPr>
-      <w:r>
-        <w:rPr>
-          <w:b/>
-          <w:sz w:val="48"/>
-        </w:rPr>
-        <w:t>Cross-Dataset Evaluation</w:t>
+        <w:t>FakeNewsNet is used as the first target dataset because it is widely used in fake news detection research and includes PolitiFact and GossipCop sources. The minimal official CSV version contains item identifiers, URLs, titles, and tweet IDs. After cleaning, the title-only target set contains 23,196 rows: 1,056 PolitiFact titles and 22,140 GossipCop titles. Because this version provides titles rather than full article text, the experiment is framed as LIAR statement to FakeNewsNet title transfer.</w:t>
+      </w:r>
+    </w:p>
+    <w:p>
+      <w:pPr>
+        <w:pStyle w:val="21"/>
+      </w:pPr>
+      <w:r>
+        <w:t>5.3 Experimental Setup</w:t>
       </w:r>
     </w:p>
     <w:p>
@@ -6708,55 +6586,7 @@
         <w:jc w:val="both"/>
       </w:pPr>
       <w:r>
-        <w:t>This chapter first reports the strict cross-dataset evaluation, where models are trained on LIAR and tested directly on FakeNewsNet minimal titles. It then extends the analysis with intermediate target-domain fine-tuning on FakeNewsNet train subsets and a simplified TELLER-like reasoning-atom pilot. The strict direct-transfer setting uses no FakeNewsNet examples for training, validation, threshold selection, or model selection; the adaptation setting uses only FakeNewsNet train/validation subsets and keeps a held-out FakeNewsNet test split for final evaluation.</w:t>
-      </w:r>
-    </w:p>
-    <w:p>
-      <w:pPr>
-        <w:pStyle w:val="21"/>
-      </w:pPr>
-      <w:r>
-        <w:t>6.1 Motivation</w:t>
-      </w:r>
-    </w:p>
-    <w:p>
-      <w:pPr>
-        <w:jc w:val="both"/>
-      </w:pPr>
-      <w:r>
-        <w:t>In-domain LIAR performance is not enough to show that a fake news detector is reliable. A model may learn dataset-specific language patterns rather than general veracity signals. Cross-dataset evaluation is therefore needed to test whether the model transfers to a different source or domain.</w:t>
-      </w:r>
-    </w:p>
-    <w:p>
-      <w:pPr>
-        <w:pStyle w:val="21"/>
-      </w:pPr>
-      <w:r>
-        <w:t>6.2 Target Dataset</w:t>
-      </w:r>
-    </w:p>
-    <w:p>
-      <w:pPr>
-        <w:jc w:val="both"/>
-      </w:pPr>
-      <w:r>
-        <w:t>FakeNewsNet is used as the first target dataset because it is widely used in fake news detection research and includes PolitiFact and GossipCop sources. The minimal official CSV version contains item identifiers, URLs, titles, and tweet IDs. After cleaning, the title-only target set contains 23,196 rows: 1,056 PolitiFact titles and 22,140 GossipCop titles. Because this version provides titles rather than full article text, the experiment is framed as LIAR statement to FakeNewsNet title transfer.</w:t>
-      </w:r>
-    </w:p>
-    <w:p>
-      <w:pPr>
-        <w:pStyle w:val="21"/>
-      </w:pPr>
-      <w:r>
-        <w:t>6.3 Experimental Setup</w:t>
-      </w:r>
-    </w:p>
-    <w:p>
-      <w:pPr>
-        <w:jc w:val="both"/>
-      </w:pPr>
-      <w:r>
-        <w:t>Three primary transfer baselines are reported—TF-IDF + Logistic Regression, weighted BERT, and weighted RoBERTa—together with an unweighted BERT control that is described in detail in Section 6.8. TF-IDF is trained on LIAR train plus validation using the selected deterministic baseline setup. The transformer baselines use the same five-seed runs as the LIAR experiments, with checkpoint selection based on LIAR validation Macro-F1. For each transformer run, the best LIAR checkpoint is loaded before testing on both LIAR test and FakeNewsNet titles.</w:t>
+        <w:t>Three primary transfer baselines are reported—TF-IDF + Logistic Regression, weighted BERT, and weighted RoBERTa—together with an unweighted BERT control that is described in detail in Section 5.8. TF-IDF is trained on LIAR train plus validation using the selected deterministic baseline setup. The transformer baselines use the same five-seed runs as the LIAR experiments, with checkpoint selection based on LIAR validation Macro-F1. For each transformer run, the best LIAR checkpoint is loaded before testing on both LIAR test and FakeNewsNet titles.</w:t>
       </w:r>
     </w:p>
     <w:p>
@@ -6771,12 +6601,7 @@
         <w:jc w:val="center"/>
       </w:pPr>
       <w:r>
-        <w:rPr>
-          <w:i/>
-          <w:sz w:val="20"/>
-        </w:rPr>
-        <w:lastRenderedPageBreak/>
-        <w:t>Table 6.1. LIAR in-domain comparison before transfer.</w:t>
+        <w:t>Table 5.1. LIAR in-domain comparison before transfer.</w:t>
       </w:r>
     </w:p>
     <w:tbl>
@@ -7058,7 +6883,7 @@
             </w:pPr>
             <w:r>
               <w:rPr>
-                <w:sz w:val="18"/>
+                <w:b w:val="0"/>
               </w:rPr>
               <w:t>0.6235</w:t>
             </w:r>
@@ -7086,7 +6911,7 @@
             </w:pPr>
             <w:r>
               <w:rPr>
-                <w:sz w:val="18"/>
+                <w:b w:val="0"/>
               </w:rPr>
               <w:t>0.6005</w:t>
             </w:r>
@@ -7114,7 +6939,7 @@
             </w:pPr>
             <w:r>
               <w:rPr>
-                <w:sz w:val="18"/>
+                <w:b/>
               </w:rPr>
               <w:t>0.7661</w:t>
             </w:r>
@@ -7142,7 +6967,7 @@
             </w:pPr>
             <w:r>
               <w:rPr>
-                <w:sz w:val="18"/>
+                <w:b w:val="0"/>
               </w:rPr>
               <w:t>0.4394</w:t>
             </w:r>
@@ -7229,7 +7054,7 @@
             </w:pPr>
             <w:r>
               <w:rPr>
-                <w:sz w:val="18"/>
+                <w:b/>
               </w:rPr>
               <w:t>0.6522</w:t>
             </w:r>
@@ -7257,7 +7082,7 @@
             </w:pPr>
             <w:r>
               <w:rPr>
-                <w:sz w:val="18"/>
+                <w:b/>
               </w:rPr>
               <w:t>0.6396</w:t>
             </w:r>
@@ -7285,7 +7110,8 @@
             </w:pPr>
             <w:r>
               <w:rPr>
-                <w:sz w:val="18"/>
+                <w:b w:val="0"/>
+                <w:u w:val="single"/>
               </w:rPr>
               <w:t>0.7443</w:t>
             </w:r>
@@ -7313,7 +7139,8 @@
             </w:pPr>
             <w:r>
               <w:rPr>
-                <w:sz w:val="18"/>
+                <w:b w:val="0"/>
+                <w:u w:val="single"/>
               </w:rPr>
               <w:t>0.5335</w:t>
             </w:r>
@@ -7400,7 +7227,8 @@
             </w:pPr>
             <w:r>
               <w:rPr>
-                <w:sz w:val="18"/>
+                <w:b w:val="0"/>
+                <w:u w:val="single"/>
               </w:rPr>
               <w:t>0.6412</w:t>
             </w:r>
@@ -7428,7 +7256,8 @@
             </w:pPr>
             <w:r>
               <w:rPr>
-                <w:sz w:val="18"/>
+                <w:b w:val="0"/>
+                <w:u w:val="single"/>
               </w:rPr>
               <w:t>0.6322</w:t>
             </w:r>
@@ -7456,7 +7285,7 @@
             </w:pPr>
             <w:r>
               <w:rPr>
-                <w:sz w:val="18"/>
+                <w:b w:val="0"/>
               </w:rPr>
               <w:t>0.7048</w:t>
             </w:r>
@@ -7484,7 +7313,7 @@
             </w:pPr>
             <w:r>
               <w:rPr>
-                <w:sz w:val="18"/>
+                <w:b/>
               </w:rPr>
               <w:t>0.5591</w:t>
             </w:r>
@@ -7492,6 +7321,11 @@
         </w:tc>
       </w:tr>
     </w:tbl>
+    <w:p>
+      <w:r>
+        <w:t>Note. Bold marks the best comparable value within a column; underlining marks the second-best. Statistical significance is not shown for deterministic, single-seed, or non-comparable literature rows.</w:t>
+      </w:r>
+    </w:p>
     <w:p/>
     <w:p>
       <w:pPr>
@@ -7500,11 +7334,7 @@
         <w:jc w:val="center"/>
       </w:pPr>
       <w:r>
-        <w:rPr>
-          <w:i/>
-          <w:sz w:val="22"/>
-        </w:rPr>
-        <w:t>Table 6.2. LIAR-to-FakeNewsNet title transfer results, including the unweighted BERT control.</w:t>
+        <w:t>Table 5.2. LIAR-to-FakeNewsNet title transfer results, including the unweighted BERT control.</w:t>
       </w:r>
     </w:p>
     <w:tbl>
@@ -7844,7 +7674,7 @@
             </w:pPr>
             <w:r>
               <w:rPr>
-                <w:sz w:val="18"/>
+                <w:b/>
               </w:rPr>
               <w:t>0.5152</w:t>
             </w:r>
@@ -7872,7 +7702,7 @@
             </w:pPr>
             <w:r>
               <w:rPr>
-                <w:sz w:val="18"/>
+                <w:b/>
               </w:rPr>
               <w:t>0.5146</w:t>
             </w:r>
@@ -7900,7 +7730,7 @@
             </w:pPr>
             <w:r>
               <w:rPr>
-                <w:sz w:val="18"/>
+                <w:b/>
               </w:rPr>
               <w:t>0.4631</w:t>
             </w:r>
@@ -7928,7 +7758,7 @@
             </w:pPr>
             <w:r>
               <w:rPr>
-                <w:sz w:val="18"/>
+                <w:b w:val="0"/>
               </w:rPr>
               <w:t>0.5903</w:t>
             </w:r>
@@ -8043,7 +7873,7 @@
             </w:pPr>
             <w:r>
               <w:rPr>
-                <w:sz w:val="18"/>
+                <w:b w:val="0"/>
               </w:rPr>
               <w:t>0.4795</w:t>
             </w:r>
@@ -8071,7 +7901,7 @@
             </w:pPr>
             <w:r>
               <w:rPr>
-                <w:sz w:val="18"/>
+                <w:b w:val="0"/>
               </w:rPr>
               <w:t>0.4196</w:t>
             </w:r>
@@ -8099,7 +7929,7 @@
             </w:pPr>
             <w:r>
               <w:rPr>
-                <w:sz w:val="18"/>
+                <w:b w:val="0"/>
               </w:rPr>
               <w:t>0.1388</w:t>
             </w:r>
@@ -8127,7 +7957,7 @@
             </w:pPr>
             <w:r>
               <w:rPr>
-                <w:sz w:val="18"/>
+                <w:b/>
               </w:rPr>
               <w:t>0.9718</w:t>
             </w:r>
@@ -8242,7 +8072,7 @@
             </w:pPr>
             <w:r>
               <w:rPr>
-                <w:sz w:val="18"/>
+                <w:b w:val="0"/>
               </w:rPr>
               <w:t>0.4835</w:t>
             </w:r>
@@ -8270,7 +8100,7 @@
             </w:pPr>
             <w:r>
               <w:rPr>
-                <w:sz w:val="18"/>
+                <w:b w:val="0"/>
               </w:rPr>
               <w:t>0.4371</w:t>
             </w:r>
@@ -8298,7 +8128,7 @@
             </w:pPr>
             <w:r>
               <w:rPr>
-                <w:sz w:val="18"/>
+                <w:b w:val="0"/>
               </w:rPr>
               <w:t>0.1782</w:t>
             </w:r>
@@ -8326,7 +8156,8 @@
             </w:pPr>
             <w:r>
               <w:rPr>
-                <w:sz w:val="18"/>
+                <w:b w:val="0"/>
+                <w:u w:val="single"/>
               </w:rPr>
               <w:t>0.9245</w:t>
             </w:r>
@@ -8441,7 +8272,7 @@
             </w:pPr>
             <w:r>
               <w:rPr>
-                <w:sz w:val="18"/>
+                <w:b/>
               </w:rPr>
               <w:t>0.4986</w:t>
             </w:r>
@@ -8469,7 +8300,7 @@
             </w:pPr>
             <w:r>
               <w:rPr>
-                <w:sz w:val="18"/>
+                <w:b/>
               </w:rPr>
               <w:t>0.4715</w:t>
             </w:r>
@@ -8497,7 +8328,7 @@
             </w:pPr>
             <w:r>
               <w:rPr>
-                <w:sz w:val="18"/>
+                <w:b/>
               </w:rPr>
               <w:t>0.4771</w:t>
             </w:r>
@@ -8525,7 +8356,7 @@
             </w:pPr>
             <w:r>
               <w:rPr>
-                <w:sz w:val="18"/>
+                <w:b w:val="0"/>
               </w:rPr>
               <w:t>0.5664</w:t>
             </w:r>
@@ -8640,7 +8471,7 @@
             </w:pPr>
             <w:r>
               <w:rPr>
-                <w:sz w:val="18"/>
+                <w:b w:val="0"/>
               </w:rPr>
               <w:t>0.2619</w:t>
             </w:r>
@@ -8668,7 +8499,7 @@
             </w:pPr>
             <w:r>
               <w:rPr>
-                <w:sz w:val="18"/>
+                <w:b w:val="0"/>
               </w:rPr>
               <w:t>0.2271</w:t>
             </w:r>
@@ -8696,7 +8527,7 @@
             </w:pPr>
             <w:r>
               <w:rPr>
-                <w:sz w:val="18"/>
+                <w:b w:val="0"/>
               </w:rPr>
               <w:t>0.0335</w:t>
             </w:r>
@@ -8724,7 +8555,7 @@
             </w:pPr>
             <w:r>
               <w:rPr>
-                <w:sz w:val="18"/>
+                <w:b/>
               </w:rPr>
               <w:t>0.9836</w:t>
             </w:r>
@@ -8839,7 +8670,7 @@
             </w:pPr>
             <w:r>
               <w:rPr>
-                <w:sz w:val="18"/>
+                <w:b w:val="0"/>
               </w:rPr>
               <w:t>0.2844</w:t>
             </w:r>
@@ -8867,7 +8698,7 @@
             </w:pPr>
             <w:r>
               <w:rPr>
-                <w:sz w:val="18"/>
+                <w:b w:val="0"/>
               </w:rPr>
               <w:t>0.2601</w:t>
             </w:r>
@@ -8895,7 +8726,7 @@
             </w:pPr>
             <w:r>
               <w:rPr>
-                <w:sz w:val="18"/>
+                <w:b w:val="0"/>
               </w:rPr>
               <w:t>0.0709</w:t>
             </w:r>
@@ -8923,7 +8754,8 @@
             </w:pPr>
             <w:r>
               <w:rPr>
-                <w:sz w:val="18"/>
+                <w:b w:val="0"/>
+                <w:u w:val="single"/>
               </w:rPr>
               <w:t>0.9589</w:t>
             </w:r>
@@ -9038,7 +8870,7 @@
             </w:pPr>
             <w:r>
               <w:rPr>
-                <w:sz w:val="18"/>
+                <w:b/>
               </w:rPr>
               <w:t>0.4993</w:t>
             </w:r>
@@ -9066,7 +8898,7 @@
             </w:pPr>
             <w:r>
               <w:rPr>
-                <w:sz w:val="18"/>
+                <w:b/>
               </w:rPr>
               <w:t>0.4745</w:t>
             </w:r>
@@ -9094,7 +8926,7 @@
             </w:pPr>
             <w:r>
               <w:rPr>
-                <w:sz w:val="18"/>
+                <w:b/>
               </w:rPr>
               <w:t>0.4766</w:t>
             </w:r>
@@ -9122,7 +8954,7 @@
             </w:pPr>
             <w:r>
               <w:rPr>
-                <w:sz w:val="18"/>
+                <w:b w:val="0"/>
               </w:rPr>
               <w:t>0.5682</w:t>
             </w:r>
@@ -9237,7 +9069,7 @@
             </w:pPr>
             <w:r>
               <w:rPr>
-                <w:sz w:val="18"/>
+                <w:b w:val="0"/>
               </w:rPr>
               <w:t>0.2718</w:t>
             </w:r>
@@ -9265,7 +9097,7 @@
             </w:pPr>
             <w:r>
               <w:rPr>
-                <w:sz w:val="18"/>
+                <w:b w:val="0"/>
               </w:rPr>
               <w:t>0.2358</w:t>
             </w:r>
@@ -9293,7 +9125,7 @@
             </w:pPr>
             <w:r>
               <w:rPr>
-                <w:sz w:val="18"/>
+                <w:b w:val="0"/>
               </w:rPr>
               <w:t>0.0372</w:t>
             </w:r>
@@ -9321,7 +9153,7 @@
             </w:pPr>
             <w:r>
               <w:rPr>
-                <w:sz w:val="18"/>
+                <w:b/>
               </w:rPr>
               <w:t>0.9827</w:t>
             </w:r>
@@ -9436,7 +9268,7 @@
             </w:pPr>
             <w:r>
               <w:rPr>
-                <w:sz w:val="18"/>
+                <w:b w:val="0"/>
               </w:rPr>
               <w:t>0.2935</w:t>
             </w:r>
@@ -9464,7 +9296,7 @@
             </w:pPr>
             <w:r>
               <w:rPr>
-                <w:sz w:val="18"/>
+                <w:b w:val="0"/>
               </w:rPr>
               <w:t>0.2682</w:t>
             </w:r>
@@ -9492,7 +9324,7 @@
             </w:pPr>
             <w:r>
               <w:rPr>
-                <w:sz w:val="18"/>
+                <w:b w:val="0"/>
               </w:rPr>
               <w:t>0.0747</w:t>
             </w:r>
@@ -9520,7 +9352,8 @@
             </w:pPr>
             <w:r>
               <w:rPr>
-                <w:sz w:val="18"/>
+                <w:b w:val="0"/>
+                <w:u w:val="single"/>
               </w:rPr>
               <w:t>0.9564</w:t>
             </w:r>
@@ -9635,7 +9468,8 @@
             </w:pPr>
             <w:r>
               <w:rPr>
-                <w:sz w:val="18"/>
+                <w:b w:val="0"/>
+                <w:u w:val="single"/>
               </w:rPr>
               <w:t>0.5114</w:t>
             </w:r>
@@ -9663,7 +9497,8 @@
             </w:pPr>
             <w:r>
               <w:rPr>
-                <w:sz w:val="18"/>
+                <w:b w:val="0"/>
+                <w:u w:val="single"/>
               </w:rPr>
               <w:t>0.4805</w:t>
             </w:r>
@@ -9691,7 +9526,8 @@
             </w:pPr>
             <w:r>
               <w:rPr>
-                <w:sz w:val="18"/>
+                <w:b w:val="0"/>
+                <w:u w:val="single"/>
               </w:rPr>
               <w:t>0.2436</w:t>
             </w:r>
@@ -9719,7 +9555,7 @@
             </w:pPr>
             <w:r>
               <w:rPr>
-                <w:sz w:val="18"/>
+                <w:b w:val="0"/>
               </w:rPr>
               <w:t>0.8981</w:t>
             </w:r>
@@ -9834,7 +9670,8 @@
             </w:pPr>
             <w:r>
               <w:rPr>
-                <w:sz w:val="18"/>
+                <w:b w:val="0"/>
+                <w:u w:val="single"/>
               </w:rPr>
               <w:t>0.2918</w:t>
             </w:r>
@@ -9859,7 +9696,8 @@
           <w:p>
             <w:r>
               <w:rPr>
-                <w:sz w:val="18"/>
+                <w:b w:val="0"/>
+                <w:u w:val="single"/>
               </w:rPr>
               <w:t>0.2710</w:t>
             </w:r>
@@ -9887,7 +9725,8 @@
             </w:pPr>
             <w:r>
               <w:rPr>
-                <w:sz w:val="18"/>
+                <w:b w:val="0"/>
+                <w:u w:val="single"/>
               </w:rPr>
               <w:t>0.0833</w:t>
             </w:r>
@@ -9915,7 +9754,7 @@
             </w:pPr>
             <w:r>
               <w:rPr>
-                <w:sz w:val="18"/>
+                <w:b w:val="0"/>
               </w:rPr>
               <w:t>0.9506</w:t>
             </w:r>
@@ -10030,7 +9869,8 @@
             </w:pPr>
             <w:r>
               <w:rPr>
-                <w:sz w:val="18"/>
+                <w:b w:val="0"/>
+                <w:u w:val="single"/>
               </w:rPr>
               <w:t>0.3018</w:t>
             </w:r>
@@ -10058,7 +9898,8 @@
             </w:pPr>
             <w:r>
               <w:rPr>
-                <w:sz w:val="18"/>
+                <w:b w:val="0"/>
+                <w:u w:val="single"/>
               </w:rPr>
               <w:t>0.2806</w:t>
             </w:r>
@@ -10086,7 +9927,8 @@
             </w:pPr>
             <w:r>
               <w:rPr>
-                <w:sz w:val="18"/>
+                <w:b w:val="0"/>
+                <w:u w:val="single"/>
               </w:rPr>
               <w:t>0.0890</w:t>
             </w:r>
@@ -10114,7 +9956,7 @@
             </w:pPr>
             <w:r>
               <w:rPr>
-                <w:sz w:val="18"/>
+                <w:b w:val="0"/>
               </w:rPr>
               <w:t>0.9467</w:t>
             </w:r>
@@ -10122,13 +9964,18 @@
         </w:tc>
       </w:tr>
     </w:tbl>
+    <w:p>
+      <w:r>
+        <w:t>Note. Bold marks the best comparable value within a column; underlining marks the second-best. Statistical significance is not shown for deterministic, single-seed, or non-comparable literature rows. Under transfer, a high FAKE recall co-occurs with near-zero REAL recall and reflects the FAKE-prediction bias discussed in Section 5.8, not better detection.</w:t>
+      </w:r>
+    </w:p>
     <w:p/>
     <w:p>
       <w:pPr>
         <w:jc w:val="both"/>
       </w:pPr>
       <w:r>
-        <w:t>To interpret the transfer results in Table 6.2, a trivial majority-class reference baseline is also reported. Because FakeNewsNet minimal titles are strongly REAL-skewed, especially in GossipCop, a classifier that always predicts REAL achieves a high target Accuracy without learning anything. Table 6.3 reports Accuracy, Macro-F1, REAL recall, and FAKE recall for this baseline on each target subset. These values are deterministic and follow directly from the target label counts reported in Section 3.2.2.</w:t>
+        <w:t>To interpret the transfer results in Table 5.2, a trivial majority-class reference baseline is also reported. Because FakeNewsNet minimal titles are strongly REAL-skewed, especially in GossipCop, a classifier that always predicts REAL achieves a high target Accuracy without learning anything. Table 5.3 reports Accuracy, Macro-F1, REAL recall, and FAKE recall for this baseline on each target subset. These values are deterministic and follow directly from the target label counts reported in Section 3.2.2.</w:t>
       </w:r>
     </w:p>
     <w:p>
@@ -10138,11 +9985,7 @@
         <w:jc w:val="center"/>
       </w:pPr>
       <w:r>
-        <w:rPr>
-          <w:i/>
-          <w:sz w:val="20"/>
-        </w:rPr>
-        <w:t>Table 6.3. Majority-class (always-REAL) reference baseline on FakeNewsNet minimal titles.</w:t>
+        <w:t>Table 5.3. Majority-class (always-REAL) reference baseline on FakeNewsNet minimal titles.</w:t>
       </w:r>
     </w:p>
     <w:tbl>
@@ -10744,14 +10587,18 @@
         </w:tc>
       </w:tr>
     </w:tbl>
+    <w:p>
+      <w:r>
+        <w:t>Note. The majority baseline is deterministic and is included as a class-prior reference, not as a learned model.</w:t>
+      </w:r>
+    </w:p>
     <w:p/>
     <w:p>
       <w:pPr>
         <w:jc w:val="both"/>
       </w:pPr>
       <w:r>
-        <w:lastRenderedPageBreak/>
-        <w:t>Two observations follow from Table 6.3. First, the majority baseline has a high Accuracy on every target subset, especially on GossipCop and the combined set, simply because FakeNewsNet titles are heavily REAL-skewed. Second, the majority baseline has a Macro-F1 below 0.45 on every subset, because predicting only one class gives a FAKE F1 of zero. This shows directly that Accuracy alone is misleading under this target distribution, and that Macro-F1 must be read alongside class-level recall when comparing transfer baselines.</w:t>
+        <w:t>Two observations follow from Table 5.3. First, the majority baseline has a high Accuracy on every target subset, especially on GossipCop and the combined set, simply because FakeNewsNet titles are heavily REAL-skewed. Second, the majority baseline has a Macro-F1 below 0.45 on every subset, because predicting only one class gives a FAKE F1 of zero. This shows directly that Accuracy alone is misleading under this target distribution, and that Macro-F1 must be read alongside class-level recall when comparing transfer baselines.</w:t>
       </w:r>
     </w:p>
     <w:p>
@@ -10759,7 +10606,7 @@
         <w:jc w:val="both"/>
       </w:pPr>
       <w:r>
-        <w:t>Comparing Table 6.2 with Table 6.3 also reframes how the four LIAR-trained transfer settings should be read. On combined titles, TF-IDF has lower Accuracy than the majority baseline (0.4993 vs 0.7519) but a slightly higher Macro-F1 (0.4745 vs 0.4292), because it produces non-trivial predictions for both classes. Weighted BERT and weighted RoBERTa, in contrast, fall below the majority baseline on both Accuracy (0.2935 and 0.2718) and Macro-F1 (0.2682 and 0.2358) on the combined target, while still reaching very high FAKE recall by strongly over-predicting FAKE. The unweighted BERT control also falls below the majority baseline on both Accuracy (0.3018) and Macro-F1 (0.2806). This means the transformer transfer results are worse than a trivial REAL-only classifier by Macro-F1 on this target, which is an important corrective to the original LIAR-only ranking.</w:t>
+        <w:t>Comparing Table 5.2 with Table 5.3 also reframes how the four LIAR-trained transfer settings should be read. On combined titles, TF-IDF has lower Accuracy than the majority baseline (0.4993 vs 0.7519) but a slightly higher Macro-F1 (0.4745 vs 0.4292), because it produces non-trivial predictions for both classes. Weighted BERT and weighted RoBERTa, in contrast, fall below the majority baseline on both Accuracy (0.2935 and 0.2718) and Macro-F1 (0.2682 and 0.2358) on the combined target, while still reaching very high FAKE recall by strongly over-predicting FAKE. The unweighted BERT control also falls below the majority baseline on both Accuracy (0.3018) and Macro-F1 (0.2806). This means the transformer transfer results are worse than a trivial REAL-only classifier by Macro-F1 on this target, which is an important corrective to the original LIAR-only ranking.</w:t>
       </w:r>
     </w:p>
     <w:p/>
@@ -10814,7 +10661,7 @@
         <w:jc w:val="both"/>
       </w:pPr>
       <w:r>
-        <w:t>Figure 6.1 compares LIAR in-domain Macro-F1 with strict transfer Macro-F1 on FakeNewsNet combined titles. The four LIAR scores are close together, but the transfer scores separate sharply: TF-IDF remains slightly above the always-REAL majority Macro-F1 reference of 0.4292, while weighted BERT, weighted RoBERTa, and the unweighted BERT control fall below it. The similar transfer scores of weighted and unweighted BERT indicate that class weighting is not the dominant cause of the cross-dataset drop.</w:t>
+        <w:t>Figure 5.1 compares LIAR in-domain Macro-F1 with strict transfer Macro-F1 on FakeNewsNet combined titles. The four LIAR scores are close together, but the transfer scores separate sharply: TF-IDF remains slightly above the always-REAL majority Macro-F1 reference of 0.4292, while weighted BERT, weighted RoBERTa, and the unweighted BERT control fall below it. The similar transfer scores of weighted and unweighted BERT indicate that class weighting is not the dominant cause of the cross-dataset drop.</w:t>
       </w:r>
     </w:p>
     <w:p>
@@ -10869,7 +10716,7 @@
         <w:jc w:val="both"/>
       </w:pPr>
       <w:r>
-        <w:t>Figure 6.2 explains the low transfer Macro-F1 of the transformer models through class-level recall. Weighted BERT and unweighted BERT sit next to each other and show almost the same pattern: REAL recall remains around 0.08, while FAKE recall stays above 0.94. Removing the class weights therefore does not correct the FAKE-heavy transfer bias.</w:t>
+        <w:t>Figure 5.2 explains the low transfer Macro-F1 of the transformer models through class-level recall. Weighted BERT and unweighted BERT sit next to each other and show almost the same pattern: REAL recall remains around 0.08, while FAKE recall stays above 0.94. Removing the class weights therefore does not correct the FAKE-heavy transfer bias.</w:t>
       </w:r>
     </w:p>
     <w:p>
@@ -10920,7 +10767,7 @@
     </w:p>
     <w:p>
       <w:r>
-        <w:t>Figure 6.3 compares the completed transfer models with the always-REAL majority baseline on FakeNewsNet combined titles. The majority baseline has the highest Accuracy because the target set is strongly REAL-skewed, while TF-IDF is the only model that marginally exceeds the majority Macro-F1. Weighted BERT and unweighted BERT remain close to each other on both metrics, reinforcing that the weighted loss is not the main explanation for the transfer failure.</w:t>
+        <w:t>Figure 5.3 compares the completed transfer models with the always-REAL majority baseline on FakeNewsNet combined titles. The majority baseline has the highest Accuracy because the target set is strongly REAL-skewed, while TF-IDF is the only model that marginally exceeds the majority Macro-F1. Weighted BERT and unweighted BERT remain close to each other on both metrics, reinforcing that the weighted loss is not the main explanation for the transfer failure.</w:t>
       </w:r>
     </w:p>
     <w:p>
@@ -10928,7 +10775,7 @@
         <w:pStyle w:val="21"/>
       </w:pPr>
       <w:r>
-        <w:t>6.4 PolitiFact Target Results</w:t>
+        <w:t>5.4 PolitiFact Target Results</w:t>
       </w:r>
     </w:p>
     <w:p>
@@ -10948,7 +10795,7 @@
         <w:pStyle w:val="21"/>
       </w:pPr>
       <w:r>
-        <w:t>6.5 GossipCop Target Results</w:t>
+        <w:t>5.5 GossipCop Target Results</w:t>
       </w:r>
     </w:p>
     <w:p>
@@ -10964,7 +10811,7 @@
         <w:pStyle w:val="21"/>
       </w:pPr>
       <w:r>
-        <w:t>6.6 Combined Target Results</w:t>
+        <w:t>5.6 Combined Target Results</w:t>
       </w:r>
     </w:p>
     <w:p>
@@ -10972,7 +10819,7 @@
         <w:jc w:val="both"/>
       </w:pPr>
       <w:r>
-        <w:t>All four LIAR-trained baselines, including the unweighted BERT control, drop substantially when moved from LIAR to FakeNewsNet titles. TF-IDF drops from 0.6005 LIAR Macro-F1 to 0.4745 on FakeNewsNet combined titles. Weighted RoBERTa, although highest on LIAR with 0.6396 Macro-F1, drops to 0.2358 on FakeNewsNet combined titles. Weighted BERT drops from 0.6322 to 0.2682. The unweighted BERT control discussed in Section 6.8 reaches 0.2806 Macro-F1 on FakeNewsNet combined titles, which is essentially the same as weighted BERT. Compared with the always-REAL majority baseline in Table 6.3, which obtains 0.4292 Macro-F1 on the combined target, only TF-IDF stays above this trivial reference on Macro-F1 (0.4745); both weighted transformer baselines and the unweighted BERT control fall below it. This is a sharper reading of the transfer failure than the LIAR-only ranking would suggest.</w:t>
+        <w:t>All four LIAR-trained baselines, including the unweighted BERT control, drop substantially when moved from LIAR to FakeNewsNet titles. TF-IDF drops from 0.6005 LIAR Macro-F1 to 0.4745 on FakeNewsNet combined titles. Weighted RoBERTa, although highest on LIAR with 0.6396 Macro-F1, drops to 0.2358 on FakeNewsNet combined titles. Weighted BERT drops from 0.6322 to 0.2682. The unweighted BERT control discussed in Section 5.8 reaches 0.2806 Macro-F1 on FakeNewsNet combined titles, which is essentially the same as weighted BERT. Compared with the always-REAL majority baseline in Table 5.3, which obtains 0.4292 Macro-F1 on the combined target, only TF-IDF stays above this trivial reference on Macro-F1 (0.4745); both weighted transformer baselines and the unweighted BERT control fall below it. This is a sharper reading of the transfer failure than the LIAR-only ranking would suggest.</w:t>
       </w:r>
     </w:p>
     <w:p>
@@ -10988,7 +10835,7 @@
         <w:pStyle w:val="21"/>
       </w:pPr>
       <w:r>
-        <w:t>6.7 Within-FakeNewsNet Subpart Transfer</w:t>
+        <w:t>5.7 Within-FakeNewsNet Subpart Transfer</w:t>
       </w:r>
     </w:p>
     <w:p>
@@ -10996,7 +10843,7 @@
         <w:jc w:val="both"/>
       </w:pPr>
       <w:r>
-        <w:t>FakeNewsNet minimal combines two source subparts, PolitiFact (political news) and GossipCop (entertainment news), which Sections 6.4-6.6 evaluated together. To check whether the domain gap also exists inside the target dataset, each subpart is evaluated in-domain and transferred to the other (experiment E7), using both the TF-IDF baseline and weighted RoBERTa on title text. Table 6.4 reports the results.</w:t>
+        <w:t>FakeNewsNet minimal combines two source subparts, PolitiFact (political news) and GossipCop (entertainment news), which Sections 5.4-5.6 evaluated together. To check whether the domain gap also exists inside the target dataset, each subpart is evaluated in-domain and transferred to the other (experiment E7), using both the TF-IDF baseline and weighted RoBERTa on title text. Table 5.4 reports the results.</w:t>
       </w:r>
     </w:p>
     <w:p>
@@ -11004,7 +10851,7 @@
         <w:jc w:val="both"/>
       </w:pPr>
       <w:r>
-        <w:t>Table 6.4. Within-FakeNewsNet subpart transfer (TF-IDF and weighted RoBERTa, title text only).</w:t>
+        <w:t>Table 5.4. Within-FakeNewsNet subpart transfer (TF-IDF and weighted RoBERTa, title text only).</w:t>
       </w:r>
     </w:p>
     <w:tbl>
@@ -11135,8 +10982,11 @@
             <w:tcW w:type="dxa" w:w="1417"/>
           </w:tcPr>
           <w:p>
-            <w:r/>
-            <w:r>
+            <w:r>
+              <w:rPr>
+                <w:b w:val="0"/>
+                <w:u w:val="single"/>
+              </w:rPr>
               <w:t>0.8377</w:t>
             </w:r>
           </w:p>
@@ -11146,8 +10996,11 @@
             <w:tcW w:type="dxa" w:w="1417"/>
           </w:tcPr>
           <w:p>
-            <w:r/>
-            <w:r>
+            <w:r>
+              <w:rPr>
+                <w:b w:val="0"/>
+                <w:u w:val="single"/>
+              </w:rPr>
               <w:t>0.8329</w:t>
             </w:r>
           </w:p>
@@ -11157,8 +11010,11 @@
             <w:tcW w:type="dxa" w:w="1417"/>
           </w:tcPr>
           <w:p>
-            <w:r/>
-            <w:r>
+            <w:r>
+              <w:rPr>
+                <w:b w:val="0"/>
+                <w:u w:val="single"/>
+              </w:rPr>
               <w:t>0.8512</w:t>
             </w:r>
           </w:p>
@@ -11168,8 +11024,11 @@
             <w:tcW w:type="dxa" w:w="1417"/>
           </w:tcPr>
           <w:p>
-            <w:r/>
-            <w:r>
+            <w:r>
+              <w:rPr>
+                <w:b w:val="0"/>
+                <w:u w:val="single"/>
+              </w:rPr>
               <w:t>0.8184</w:t>
             </w:r>
           </w:p>
@@ -11203,8 +11062,10 @@
             <w:tcW w:type="dxa" w:w="1417"/>
           </w:tcPr>
           <w:p>
-            <w:r/>
-            <w:r>
+            <w:r>
+              <w:rPr>
+                <w:b/>
+              </w:rPr>
               <w:t>0.9245</w:t>
             </w:r>
           </w:p>
@@ -11214,8 +11075,10 @@
             <w:tcW w:type="dxa" w:w="1417"/>
           </w:tcPr>
           <w:p>
-            <w:r/>
-            <w:r>
+            <w:r>
+              <w:rPr>
+                <w:b/>
+              </w:rPr>
               <w:t>0.9205</w:t>
             </w:r>
           </w:p>
@@ -11225,8 +11088,10 @@
             <w:tcW w:type="dxa" w:w="1417"/>
           </w:tcPr>
           <w:p>
-            <w:r/>
-            <w:r>
+            <w:r>
+              <w:rPr>
+                <w:b/>
+              </w:rPr>
               <w:t>0.9760</w:t>
             </w:r>
           </w:p>
@@ -11236,8 +11101,10 @@
             <w:tcW w:type="dxa" w:w="1417"/>
           </w:tcPr>
           <w:p>
-            <w:r/>
-            <w:r>
+            <w:r>
+              <w:rPr>
+                <w:b/>
+              </w:rPr>
               <w:t>0.8506</w:t>
             </w:r>
           </w:p>
@@ -11271,8 +11138,11 @@
             <w:tcW w:type="dxa" w:w="1417"/>
           </w:tcPr>
           <w:p>
-            <w:r/>
-            <w:r>
+            <w:r>
+              <w:rPr>
+                <w:b w:val="0"/>
+                <w:u w:val="single"/>
+              </w:rPr>
               <w:t>0.8311</w:t>
             </w:r>
           </w:p>
@@ -11282,8 +11152,11 @@
             <w:tcW w:type="dxa" w:w="1417"/>
           </w:tcPr>
           <w:p>
-            <w:r/>
-            <w:r>
+            <w:r>
+              <w:rPr>
+                <w:b w:val="0"/>
+                <w:u w:val="single"/>
+              </w:rPr>
               <w:t>0.7814</w:t>
             </w:r>
           </w:p>
@@ -11293,8 +11166,11 @@
             <w:tcW w:type="dxa" w:w="1417"/>
           </w:tcPr>
           <w:p>
-            <w:r/>
-            <w:r>
+            <w:r>
+              <w:rPr>
+                <w:b w:val="0"/>
+                <w:u w:val="single"/>
+              </w:rPr>
               <w:t>0.8609</w:t>
             </w:r>
           </w:p>
@@ -11304,8 +11180,11 @@
             <w:tcW w:type="dxa" w:w="1417"/>
           </w:tcPr>
           <w:p>
-            <w:r/>
-            <w:r>
+            <w:r>
+              <w:rPr>
+                <w:b w:val="0"/>
+                <w:u w:val="single"/>
+              </w:rPr>
               <w:t>0.7369</w:t>
             </w:r>
           </w:p>
@@ -11339,8 +11218,10 @@
             <w:tcW w:type="dxa" w:w="1417"/>
           </w:tcPr>
           <w:p>
-            <w:r/>
-            <w:r>
+            <w:r>
+              <w:rPr>
+                <w:b/>
+              </w:rPr>
               <w:t>0.8437</w:t>
             </w:r>
           </w:p>
@@ -11350,8 +11231,10 @@
             <w:tcW w:type="dxa" w:w="1417"/>
           </w:tcPr>
           <w:p>
-            <w:r/>
-            <w:r>
+            <w:r>
+              <w:rPr>
+                <w:b/>
+              </w:rPr>
               <w:t>0.7962</w:t>
             </w:r>
           </w:p>
@@ -11361,8 +11244,10 @@
             <w:tcW w:type="dxa" w:w="1417"/>
           </w:tcPr>
           <w:p>
-            <w:r/>
-            <w:r>
+            <w:r>
+              <w:rPr>
+                <w:b/>
+              </w:rPr>
               <w:t>0.8733</w:t>
             </w:r>
           </w:p>
@@ -11372,8 +11257,10 @@
             <w:tcW w:type="dxa" w:w="1417"/>
           </w:tcPr>
           <w:p>
-            <w:r/>
-            <w:r>
+            <w:r>
+              <w:rPr>
+                <w:b/>
+              </w:rPr>
               <w:t>0.7502</w:t>
             </w:r>
           </w:p>
@@ -11407,8 +11294,10 @@
             <w:tcW w:type="dxa" w:w="1417"/>
           </w:tcPr>
           <w:p>
-            <w:r/>
-            <w:r>
+            <w:r>
+              <w:rPr>
+                <w:b/>
+              </w:rPr>
               <w:t>0.4244</w:t>
             </w:r>
           </w:p>
@@ -11418,8 +11307,10 @@
             <w:tcW w:type="dxa" w:w="1417"/>
           </w:tcPr>
           <w:p>
-            <w:r/>
-            <w:r>
+            <w:r>
+              <w:rPr>
+                <w:b/>
+              </w:rPr>
               <w:t>0.4185</w:t>
             </w:r>
           </w:p>
@@ -11429,8 +11320,10 @@
             <w:tcW w:type="dxa" w:w="1417"/>
           </w:tcPr>
           <w:p>
-            <w:r/>
-            <w:r>
+            <w:r>
+              <w:rPr>
+                <w:b/>
+              </w:rPr>
               <w:t>0.3457</w:t>
             </w:r>
           </w:p>
@@ -11440,8 +11333,11 @@
             <w:tcW w:type="dxa" w:w="1417"/>
           </w:tcPr>
           <w:p>
-            <w:r/>
-            <w:r>
+            <w:r>
+              <w:rPr>
+                <w:b w:val="0"/>
+                <w:u w:val="single"/>
+              </w:rPr>
               <w:t>0.6729</w:t>
             </w:r>
           </w:p>
@@ -11475,8 +11371,11 @@
             <w:tcW w:type="dxa" w:w="1417"/>
           </w:tcPr>
           <w:p>
-            <w:r/>
-            <w:r>
+            <w:r>
+              <w:rPr>
+                <w:b w:val="0"/>
+                <w:u w:val="single"/>
+              </w:rPr>
               <w:t>0.3018</w:t>
             </w:r>
           </w:p>
@@ -11486,8 +11385,11 @@
             <w:tcW w:type="dxa" w:w="1417"/>
           </w:tcPr>
           <w:p>
-            <w:r/>
-            <w:r>
+            <w:r>
+              <w:rPr>
+                <w:b w:val="0"/>
+                <w:u w:val="single"/>
+              </w:rPr>
               <w:t>0.2860</w:t>
             </w:r>
           </w:p>
@@ -11497,8 +11399,11 @@
             <w:tcW w:type="dxa" w:w="1417"/>
           </w:tcPr>
           <w:p>
-            <w:r/>
-            <w:r>
+            <w:r>
+              <w:rPr>
+                <w:b w:val="0"/>
+                <w:u w:val="single"/>
+              </w:rPr>
               <w:t>0.1007</w:t>
             </w:r>
           </w:p>
@@ -11508,8 +11413,10 @@
             <w:tcW w:type="dxa" w:w="1417"/>
           </w:tcPr>
           <w:p>
-            <w:r/>
-            <w:r>
+            <w:r>
+              <w:rPr>
+                <w:b/>
+              </w:rPr>
               <w:t>0.9371</w:t>
             </w:r>
           </w:p>
@@ -11543,8 +11450,10 @@
             <w:tcW w:type="dxa" w:w="1417"/>
           </w:tcPr>
           <w:p>
-            <w:r/>
-            <w:r>
+            <w:r>
+              <w:rPr>
+                <w:b/>
+              </w:rPr>
               <w:t>0.6193</w:t>
             </w:r>
           </w:p>
@@ -11554,8 +11463,10 @@
             <w:tcW w:type="dxa" w:w="1417"/>
           </w:tcPr>
           <w:p>
-            <w:r/>
-            <w:r>
+            <w:r>
+              <w:rPr>
+                <w:b/>
+              </w:rPr>
               <w:t>0.5411</w:t>
             </w:r>
           </w:p>
@@ -11565,8 +11476,10 @@
             <w:tcW w:type="dxa" w:w="1417"/>
           </w:tcPr>
           <w:p>
-            <w:r/>
-            <w:r>
+            <w:r>
+              <w:rPr>
+                <w:b/>
+              </w:rPr>
               <w:t>0.8734</w:t>
             </w:r>
           </w:p>
@@ -11576,8 +11489,11 @@
             <w:tcW w:type="dxa" w:w="1417"/>
           </w:tcPr>
           <w:p>
-            <w:r/>
-            <w:r>
+            <w:r>
+              <w:rPr>
+                <w:b w:val="0"/>
+                <w:u w:val="single"/>
+              </w:rPr>
               <w:t>0.2523</w:t>
             </w:r>
           </w:p>
@@ -11611,8 +11527,11 @@
             <w:tcW w:type="dxa" w:w="1417"/>
           </w:tcPr>
           <w:p>
-            <w:r/>
-            <w:r>
+            <w:r>
+              <w:rPr>
+                <w:b w:val="0"/>
+                <w:u w:val="single"/>
+              </w:rPr>
               <w:t>0.4725</w:t>
             </w:r>
           </w:p>
@@ -11622,8 +11541,11 @@
             <w:tcW w:type="dxa" w:w="1417"/>
           </w:tcPr>
           <w:p>
-            <w:r/>
-            <w:r>
+            <w:r>
+              <w:rPr>
+                <w:b w:val="0"/>
+                <w:u w:val="single"/>
+              </w:rPr>
               <w:t>0.4722</w:t>
             </w:r>
           </w:p>
@@ -11633,8 +11555,11 @@
             <w:tcW w:type="dxa" w:w="1417"/>
           </w:tcPr>
           <w:p>
-            <w:r/>
-            <w:r>
+            <w:r>
+              <w:rPr>
+                <w:b w:val="0"/>
+                <w:u w:val="single"/>
+              </w:rPr>
               <w:t>0.3798</w:t>
             </w:r>
           </w:p>
@@ -11644,8 +11569,10 @@
             <w:tcW w:type="dxa" w:w="1417"/>
           </w:tcPr>
           <w:p>
-            <w:r/>
-            <w:r>
+            <w:r>
+              <w:rPr>
+                <w:b/>
+              </w:rPr>
               <w:t>0.6065</w:t>
             </w:r>
           </w:p>
@@ -11653,6 +11580,11 @@
       </w:tr>
     </w:tbl>
     <w:p>
+      <w:r>
+        <w:t>Note. Bold marks the best comparable value within a column; underlining marks the second-best. Statistical significance is not shown for deterministic, single-seed, or non-comparable literature rows. Under transfer, a high FAKE recall co-occurs with near-zero REAL recall and reflects the FAKE-prediction bias discussed in Section 5.8, not better detection.</w:t>
+      </w:r>
+    </w:p>
+    <w:p>
       <w:pPr>
         <w:jc w:val="both"/>
       </w:pPr>
@@ -11665,7 +11597,7 @@
         <w:pStyle w:val="21"/>
       </w:pPr>
       <w:r>
-        <w:t>6.8 Why Transformers Over-Predict FAKE</w:t>
+        <w:t>5.8 Why Transformers Over-Predict FAKE</w:t>
       </w:r>
     </w:p>
     <w:p>
@@ -11693,7 +11625,7 @@
         <w:jc w:val="both"/>
       </w:pPr>
       <w:r>
-        <w:t>To test this explanation, an unweighted BERT control was trained on LIAR with the same five-seed protocol, the same validation Macro-F1 checkpoint selection, and the same evaluation pipeline as the weighted BERT model in Table 6.1, but without the inverse-frequency class weights. The unweighted BERT control was then transferred to the same FakeNewsNet PolitiFact, GossipCop, and combined title targets. Table 6.2 reports the resulting five-seed mean metrics, including the GossipCop Macro-F1 value computed from the saved unweighted BERT transfer summary.</w:t>
+        <w:t>To test this explanation, an unweighted BERT control was trained on LIAR with the same five-seed protocol, the same validation Macro-F1 checkpoint selection, and the same evaluation pipeline as the weighted BERT model in Table 5.1, but without the inverse-frequency class weights. The unweighted BERT control was then transferred to the same FakeNewsNet PolitiFact, GossipCop, and combined title targets. Table 5.2 reports the resulting five-seed mean metrics, including the GossipCop Macro-F1 value computed from the saved unweighted BERT transfer summary.</w:t>
       </w:r>
     </w:p>
     <w:p>
@@ -11701,7 +11633,7 @@
         <w:jc w:val="both"/>
       </w:pPr>
       <w:r>
-        <w:t>The unweighted BERT control behaves very similarly to weighted BERT on the FakeNewsNet target. On combined titles, unweighted BERT obtains Accuracy 0.3018, Macro-F1 0.2806, REAL recall 0.0890, and FAKE recall 0.9467, compared with 0.2935, 0.2682, 0.0747, and 0.9564 for weighted BERT. The improvement in REAL recall when class weights are removed is therefore small (around one percentage point on combined titles, and roughly seven points on PolitiFact titles). Both versions still classify over ninety percent of FakeNewsNet combined titles as FAKE, and both fall below the always-REAL majority baseline in Table 6.3 on both Accuracy and Macro-F1. This means that class weighting is not the main cause of the FAKE over-prediction observed in Section 6.6: removing the weights leaves the same qualitative failure mode in place.</w:t>
+        <w:t>The unweighted BERT control behaves very similarly to weighted BERT on the FakeNewsNet target. On combined titles, unweighted BERT obtains Accuracy 0.3018, Macro-F1 0.2806, REAL recall 0.0890, and FAKE recall 0.9467, compared with 0.2935, 0.2682, 0.0747, and 0.9564 for weighted BERT. The improvement in REAL recall when class weights are removed is therefore small (around one percentage point on combined titles, and roughly seven points on PolitiFact titles). Both versions still classify over ninety percent of FakeNewsNet combined titles as FAKE, and both fall below the always-REAL majority baseline in Table 5.3 on both Accuracy and Macro-F1. This means that class weighting is not the main cause of the FAKE over-prediction observed in Section 5.6: removing the weights leaves the same qualitative failure mode in place.</w:t>
       </w:r>
     </w:p>
     <w:p>
@@ -11709,7 +11641,7 @@
         <w:jc w:val="both"/>
       </w:pPr>
       <w:r>
-        <w:t>A more plausible explanation is therefore distribution shift between LIAR statements and FakeNewsNet titles, rather than the choice of loss weighting. LIAR contains short political fact-checking claims, often written as direct accusations or factual statements; FakeNewsNet titles are news headlines, with a different style, a different topic distribution, and a different class prior. Both the weighted and unweighted BERT decision boundaries learned on LIAR appear to treat many title patterns as FAKE-like, producing a strong FAKE-heavy transfer bias. This reading is consistent with the recall-plane pattern in the recall comparison in Figure 6.4 and is the central evidence that strong in-domain performance does not imply transferable veracity signals. A complementary unweighted RoBERTa control is the obvious next experiment to confirm that the same effect appears in the RoBERTa family; this is not completed in the current dissertation and is recorded as a remaining methodological item in Chapter 7 and Section 8.4.</w:t>
+        <w:t>A more plausible explanation is therefore distribution shift between LIAR statements and FakeNewsNet titles, rather than the choice of loss weighting. LIAR contains short political fact-checking claims, often written as direct accusations or factual statements; FakeNewsNet titles are news headlines, with a different style, a different topic distribution, and a different class prior. Both the weighted and unweighted BERT decision boundaries learned on LIAR appear to treat many title patterns as FAKE-like, producing a strong FAKE-heavy transfer bias. This reading is consistent with the recall-plane pattern in the recall comparison in Figure 5.4 and is the central evidence that strong in-domain performance does not imply transferable veracity signals. A complementary unweighted RoBERTa control is the obvious next experiment to confirm that the same effect appears in the RoBERTa family; this is not completed in the current dissertation and is recorded as a remaining methodological item in Chapter 5 and Section 6.4.</w:t>
       </w:r>
     </w:p>
     <w:p>
@@ -11764,7 +11696,7 @@
         <w:pStyle w:val="21"/>
       </w:pPr>
       <w:r>
-        <w:t>6.9 Intermediate Fine-Tuning with Target-Domain FakeNewsNet Titles</w:t>
+        <w:t>5.9 Intermediate Fine-Tuning with Target-Domain FakeNewsNet Titles</w:t>
       </w:r>
     </w:p>
     <w:p>
@@ -11782,7 +11714,7 @@
         <w:keepNext/>
       </w:pPr>
       <w:r>
-        <w:t>Table 6.5. Integrated comparison of in-domain, direct transfer, intermediate fine-tuning, and TELLER-like pilot results.</w:t>
+        <w:t>Table 5.5. Integrated comparison of in-domain, direct transfer, intermediate fine-tuning, and TELLER-like pilot results.</w:t>
       </w:r>
     </w:p>
     <w:tbl>
@@ -12295,9 +12227,7 @@
             </w:pPr>
             <w:r>
               <w:rPr>
-                <w:rFonts w:ascii="Times New Roman" w:hAnsi="Times New Roman"/>
                 <w:b w:val="0"/>
-                <w:sz w:val="16"/>
               </w:rPr>
               <w:t>0.2718</w:t>
             </w:r>
@@ -12323,9 +12253,7 @@
             </w:pPr>
             <w:r>
               <w:rPr>
-                <w:rFonts w:ascii="Times New Roman" w:hAnsi="Times New Roman"/>
                 <w:b w:val="0"/>
-                <w:sz w:val="16"/>
               </w:rPr>
               <w:t>0.2358</w:t>
             </w:r>
@@ -12351,9 +12279,7 @@
             </w:pPr>
             <w:r>
               <w:rPr>
-                <w:rFonts w:ascii="Times New Roman" w:hAnsi="Times New Roman"/>
                 <w:b w:val="0"/>
-                <w:sz w:val="16"/>
               </w:rPr>
               <w:t>0.0372</w:t>
             </w:r>
@@ -12379,9 +12305,8 @@
             </w:pPr>
             <w:r>
               <w:rPr>
-                <w:rFonts w:ascii="Times New Roman" w:hAnsi="Times New Roman"/>
                 <w:b w:val="0"/>
-                <w:sz w:val="16"/>
+                <w:u w:val="single"/>
               </w:rPr>
               <w:t>0.9827</w:t>
             </w:r>
@@ -12494,9 +12419,7 @@
             </w:pPr>
             <w:r>
               <w:rPr>
-                <w:rFonts w:ascii="Times New Roman" w:hAnsi="Times New Roman"/>
                 <w:b w:val="0"/>
-                <w:sz w:val="16"/>
               </w:rPr>
               <w:t>0.2725</w:t>
             </w:r>
@@ -12521,9 +12444,7 @@
             </w:pPr>
             <w:r>
               <w:rPr>
-                <w:rFonts w:ascii="Times New Roman" w:hAnsi="Times New Roman"/>
                 <w:b w:val="0"/>
-                <w:sz w:val="16"/>
               </w:rPr>
               <w:t>0.2364</w:t>
             </w:r>
@@ -12548,9 +12469,7 @@
             </w:pPr>
             <w:r>
               <w:rPr>
-                <w:rFonts w:ascii="Times New Roman" w:hAnsi="Times New Roman"/>
                 <w:b w:val="0"/>
-                <w:sz w:val="16"/>
               </w:rPr>
               <w:t>0.0377</w:t>
             </w:r>
@@ -12575,9 +12494,7 @@
             </w:pPr>
             <w:r>
               <w:rPr>
-                <w:rFonts w:ascii="Times New Roman" w:hAnsi="Times New Roman"/>
-                <w:b w:val="0"/>
-                <w:sz w:val="16"/>
+                <w:b/>
               </w:rPr>
               <w:t>0.9842</w:t>
             </w:r>
@@ -12692,9 +12609,7 @@
             </w:pPr>
             <w:r>
               <w:rPr>
-                <w:rFonts w:ascii="Times New Roman" w:hAnsi="Times New Roman"/>
                 <w:b w:val="0"/>
-                <w:sz w:val="16"/>
               </w:rPr>
               <w:t>0.7519</w:t>
             </w:r>
@@ -12720,9 +12635,7 @@
             </w:pPr>
             <w:r>
               <w:rPr>
-                <w:rFonts w:ascii="Times New Roman" w:hAnsi="Times New Roman"/>
                 <w:b w:val="0"/>
-                <w:sz w:val="16"/>
               </w:rPr>
               <w:t>0.4292</w:t>
             </w:r>
@@ -12748,9 +12661,7 @@
             </w:pPr>
             <w:r>
               <w:rPr>
-                <w:rFonts w:ascii="Times New Roman" w:hAnsi="Times New Roman"/>
-                <w:b w:val="0"/>
-                <w:sz w:val="16"/>
+                <w:b/>
               </w:rPr>
               <w:t>1.0000</w:t>
             </w:r>
@@ -12776,9 +12687,7 @@
             </w:pPr>
             <w:r>
               <w:rPr>
-                <w:rFonts w:ascii="Times New Roman" w:hAnsi="Times New Roman"/>
                 <w:b w:val="0"/>
-                <w:sz w:val="16"/>
               </w:rPr>
               <w:t>0.0000</w:t>
             </w:r>
@@ -12891,9 +12800,8 @@
             </w:pPr>
             <w:r>
               <w:rPr>
-                <w:rFonts w:ascii="Times New Roman" w:hAnsi="Times New Roman"/>
                 <w:b w:val="0"/>
-                <w:sz w:val="16"/>
+                <w:u w:val="single"/>
               </w:rPr>
               <w:t>0.8083</w:t>
             </w:r>
@@ -12918,11 +12826,10 @@
             </w:pPr>
             <w:r>
               <w:rPr>
-                <w:rFonts w:ascii="Times New Roman" w:hAnsi="Times New Roman"/>
                 <w:b w:val="0"/>
-                <w:sz w:val="16"/>
-              </w:rPr>
-              <w:t>0.7035</w:t>
+                <w:u w:val="single"/>
+              </w:rPr>
+              <w:t>0.7035*</w:t>
             </w:r>
           </w:p>
         </w:tc>
@@ -12945,9 +12852,8 @@
             </w:pPr>
             <w:r>
               <w:rPr>
-                <w:rFonts w:ascii="Times New Roman" w:hAnsi="Times New Roman"/>
                 <w:b w:val="0"/>
-                <w:sz w:val="16"/>
+                <w:u w:val="single"/>
               </w:rPr>
               <w:t>0.9305</w:t>
             </w:r>
@@ -12972,9 +12878,7 @@
             </w:pPr>
             <w:r>
               <w:rPr>
-                <w:rFonts w:ascii="Times New Roman" w:hAnsi="Times New Roman"/>
                 <w:b w:val="0"/>
-                <w:sz w:val="16"/>
               </w:rPr>
               <w:t>0.4379</w:t>
             </w:r>
@@ -13086,9 +12990,7 @@
             </w:pPr>
             <w:r>
               <w:rPr>
-                <w:rFonts w:ascii="Times New Roman" w:hAnsi="Times New Roman"/>
-                <w:b w:val="0"/>
-                <w:sz w:val="16"/>
+                <w:b/>
               </w:rPr>
               <w:t>0.8243</w:t>
             </w:r>
@@ -13113,11 +13015,9 @@
             </w:pPr>
             <w:r>
               <w:rPr>
-                <w:rFonts w:ascii="Times New Roman" w:hAnsi="Times New Roman"/>
-                <w:b w:val="0"/>
-                <w:sz w:val="16"/>
-              </w:rPr>
-              <w:t>0.7463</w:t>
+                <w:b/>
+              </w:rPr>
+              <w:t>0.7463*</w:t>
             </w:r>
           </w:p>
         </w:tc>
@@ -13140,9 +13040,7 @@
             </w:pPr>
             <w:r>
               <w:rPr>
-                <w:rFonts w:ascii="Times New Roman" w:hAnsi="Times New Roman"/>
                 <w:b w:val="0"/>
-                <w:sz w:val="16"/>
               </w:rPr>
               <w:t>0.9167</w:t>
             </w:r>
@@ -13167,9 +13065,7 @@
             </w:pPr>
             <w:r>
               <w:rPr>
-                <w:rFonts w:ascii="Times New Roman" w:hAnsi="Times New Roman"/>
                 <w:b w:val="0"/>
-                <w:sz w:val="16"/>
               </w:rPr>
               <w:t>0.5444</w:t>
             </w:r>
@@ -13610,6 +13506,11 @@
     </w:tbl>
     <w:p>
       <w:r>
+        <w:t>Note. Bold marks the best comparable value within a column; underlining marks the second-best. Asterisks mark intermediate fine-tuning Macro-F1 values significantly higher than direct transfer by paired two-sided t-test on five seeds (10%: p = 0.000015; 20%: p = 0.000003). The 20% setting is also significantly higher than 10% (p = 0.033262). Under transfer, a high FAKE recall co-occurs with near-zero REAL recall and reflects the FAKE-prediction bias discussed in Section 5.8, not better detection.</w:t>
+      </w:r>
+    </w:p>
+    <w:p>
+      <w:r>
         <w:t>The intermediate fine-tuning results change the interpretation of the cross-dataset experiment. With no target-domain adaptation, the LIAR-trained weighted RoBERTa model is almost entirely FAKE-biased on the held-out FakeNewsNet test split, with five-seed mean FAKE recall 0.9842 but REAL recall only 0.0377. The 5% target-domain setting does not solve the problem in the seed-42 run; it flips the bias in the opposite direction and predicts nearly all target examples as REAL, producing high Accuracy but a weak Macro-F1 of 0.4292. The five-seed 10% and 20% settings are more meaningful. With 10% target data, mean Macro-F1 rises to 0.7035, and with 20% target data it reaches 0.7463 while preserving high REAL recall and improving FAKE recall to 0.5444.</w:t>
       </w:r>
     </w:p>
@@ -13623,7 +13524,7 @@
         <w:pStyle w:val="21"/>
       </w:pPr>
       <w:r>
-        <w:t>6.10 TELLER-like LLM Reasoning-Atoms Pilot</w:t>
+        <w:t>5.10 TELLER-like LLM Reasoning-Atoms Pilot</w:t>
       </w:r>
     </w:p>
     <w:p>
@@ -13645,7 +13546,7 @@
         <w:pStyle w:val="21"/>
       </w:pPr>
       <w:r>
-        <w:t>6.11 Summary against RQ5</w:t>
+        <w:t>5.11 Summary against RQ3 and RQ4</w:t>
       </w:r>
     </w:p>
     <w:p>
@@ -13653,7 +13554,7 @@
         <w:jc w:val="both"/>
       </w:pPr>
       <w:r>
-        <w:t>RQ5 asks how well LIAR-trained baselines transfer to FakeNewsNet minimal titles. Under strict direct transfer, the answer remains weak: the transformer models over-predict FAKE and perform below the always-REAL majority-class reference on the combined target. However, the intermediate fine-tuning experiment shows that this failure can be partly corrected when enough labelled target-domain examples are introduced. Five percent target data is not sufficient in the seed-42 run and collapses toward REAL predictions, but the five-seed 10% and 20% target-domain fine-tuning results substantially improve the held-out FakeNewsNet test result, reaching 0.7035 and 0.7463 Macro-F1 respectively. The final answer to RQ5 is therefore two-part: strict zero-shot transfer is unreliable, but intermediate fine-tuning with a modest labelled target subset can recover useful target-domain performance.</w:t>
+        <w:t>RQ3 asks whether LIAR-trained classifiers remain reliable on FakeNewsNet minimal titles without adaptation. Under strict direct transfer, the answer is no: the transformer models over-predict FAKE and perform below the always-REAL majority-class reference on the combined target. RQ4 asks whether limited target-domain fine-tuning can recover the failure. The answer is yes once enough labelled target data is used: the five-seed 10% and 20% target-domain fine-tuning results substantially improve the held-out FakeNewsNet test result, reaching 0.7035 and 0.7463 Macro-F1 respectively.</w:t>
       </w:r>
     </w:p>
     <w:p>
@@ -13661,7 +13562,7 @@
         <w:pStyle w:val="21"/>
       </w:pPr>
       <w:r>
-        <w:t>6.12 Limitations of the Transfer Setting</w:t>
+        <w:t>5.12 Limitations of the Transfer Setting</w:t>
       </w:r>
     </w:p>
     <w:p>
@@ -13679,15 +13580,11 @@
     </w:p>
     <w:p>
       <w:pPr>
+        <w:pageBreakBefore/>
         <w:spacing w:before="720" w:after="360"/>
       </w:pPr>
       <w:r>
-        <w:rPr>
-          <w:b/>
-          <w:sz w:val="48"/>
-        </w:rPr>
-        <w:lastRenderedPageBreak/>
-        <w:t>Chapter 7</w:t>
+        <w:t>Chapter 6</w:t>
       </w:r>
     </w:p>
     <w:p>
@@ -13695,10 +13592,6 @@
         <w:spacing w:after="480"/>
       </w:pPr>
       <w:r>
-        <w:rPr>
-          <w:b/>
-          <w:sz w:val="48"/>
-        </w:rPr>
         <w:t>Discussion</w:t>
       </w:r>
     </w:p>
@@ -13707,7 +13600,7 @@
         <w:pStyle w:val="21"/>
       </w:pPr>
       <w:r>
-        <w:t>7.1 Main Findings</w:t>
+        <w:t>6.1 Main Findings</w:t>
       </w:r>
     </w:p>
     <w:p>
@@ -13731,7 +13624,7 @@
         <w:jc w:val="both"/>
       </w:pPr>
       <w:r>
-        <w:t>Among the completed local baselines, weighted RoBERTa achieves the highest mean Macro-F1, though the gap to weighted BERT is modest. With a five-seed mean Accuracy of 0.6522 and Macro-F1 of 0.6396, it is the strongest balanced model in the LIAR in-domain setting. Its FAKE recall is lower than weighted BERT, however, so it should not be read as the best model for every use case. Without a paired statistical test on the per-seed Macro-F1 values, the two weighted transformer variants are best interpreted as comparable rather than clearly ranked.</w:t>
+        <w:t>Among the completed local baselines, weighted RoBERTa achieves the highest mean Macro-F1, though the gap to weighted BERT is modest. With a five-seed mean Accuracy of 0.6522 and Macro-F1 of 0.6396, it is the strongest balanced model in the LIAR in-domain setting. Its FAKE recall is lower than weighted BERT, however, so it should not be read as the best model for every use case. The paired five-seed tests do not make the LIAR transformer ranking statistically decisive: weighted RoBERTa versus weighted BERT is not significant (p = 0.1765), and weighted RoBERTa versus unweighted BERT is also not significant (p = 0.1337). The practical reading is therefore that the weighted transformer variants are close, while their class-level recall profiles differ.</w:t>
       </w:r>
     </w:p>
     <w:p>
@@ -13759,7 +13652,7 @@
         <w:pStyle w:val="21"/>
       </w:pPr>
       <w:r>
-        <w:t>7.2 Comparison with Prior Cross-Domain Work</w:t>
+        <w:t>6.2 Comparison with Prior Cross-Domain Work</w:t>
       </w:r>
     </w:p>
     <w:p>
@@ -13767,7 +13660,7 @@
         <w:jc w:val="both"/>
       </w:pPr>
       <w:r>
-        <w:t>The transfer results in this dissertation can be placed next to prior cross-domain fake-news work (reviewed in Section 2.5). Direct numeric comparison is limited because most prior systems use non-text signals (propagation graphs) or specialised architectures and different datasets, so the comparison is about the pattern and about positioning this work as a reproducible, text-only baseline. Table 7.1 summarises the comparison.</w:t>
+        <w:t>The transfer results in this dissertation can be placed next to prior cross-domain fake-news work (reviewed in Section 2.5). Direct numeric comparison is limited because most prior systems use non-text signals (propagation graphs) or specialised architectures and different datasets, so the comparison is about the pattern and about positioning this work as a reproducible, text-only baseline. Table 6.1 summarises the comparison.</w:t>
       </w:r>
     </w:p>
     <w:p>
@@ -13775,7 +13668,7 @@
         <w:jc w:val="both"/>
       </w:pPr>
       <w:r>
-        <w:t>Table 7.1. This dissertation's transfer results compared with prior cross-domain fake-news work.</w:t>
+        <w:t>Table 6.1. This dissertation's transfer results compared with prior cross-domain fake-news work.</w:t>
       </w:r>
     </w:p>
     <w:tbl>
@@ -14264,6 +14157,11 @@
       </w:tr>
     </w:tbl>
     <w:p>
+      <w:r>
+        <w:t>Note. Results are not ranked because datasets, inputs, and methods differ; this table positions the dissertation result against prior patterns.</w:t>
+      </w:r>
+    </w:p>
+    <w:p>
       <w:pPr>
         <w:jc w:val="both"/>
       </w:pPr>
@@ -14276,7 +14174,7 @@
         <w:pStyle w:val="21"/>
       </w:pPr>
       <w:r>
-        <w:t>7.3 Implications</w:t>
+        <w:t>6.3 Implications</w:t>
       </w:r>
     </w:p>
     <w:p>
@@ -14292,7 +14190,7 @@
         <w:jc w:val="both"/>
       </w:pPr>
       <w:r>
-        <w:t>The cross-dataset results have a stronger implication. A model can look strong on LIAR but fail badly when tested on another dataset. Intermediate fine-tuning shows that this failure is not permanent: with 10-20% labelled FakeNewsNet target data, the model can recalibrate and recover much stronger Macro-F1. This means practical fake news detection should report both strict transfer and adaptation results, because zero-shot robustness and target-domain recoverability answer different questions.</w:t>
+        <w:t>The cross-dataset results have a stronger implication. A model can look strong on LIAR but fail badly when tested on another dataset. Intermediate fine-tuning shows that this failure is not permanent: with 10-20% labelled FakeNewsNet target data, the model can recalibrate and recover much stronger Macro-F1. The paired five-seed tests show that both 10% and 20% intermediate fine-tuning significantly outperform direct transfer on Macro-F1, and that the 20% setting is also significantly higher than the 10% setting. Practical fake news detection should therefore report both strict transfer and adaptation results, because zero-shot robustness and target-domain recoverability answer different questions.</w:t>
       </w:r>
     </w:p>
     <w:p>
@@ -14308,7 +14206,7 @@
         <w:pStyle w:val="21"/>
       </w:pPr>
       <w:r>
-        <w:t>7.4 Limitations</w:t>
+        <w:t>6.4 Limitations</w:t>
       </w:r>
     </w:p>
     <w:p>
@@ -14340,8 +14238,7 @@
         <w:jc w:val="both"/>
       </w:pPr>
       <w:r>
-        <w:lastRenderedPageBreak/>
-        <w:t>The fourth limitation is that the context and threshold checks in Sections 5.4 and 5.5 are preliminary rather than fully tabulated experiments. Their exact metrics are not recorded in the result files reported in this dissertation, so they are presented as exploratory observations and not as quantitative evidence. Re-running these checks with logged metrics is listed as future work.</w:t>
+        <w:t>The fourth limitation is that the context and threshold checks in Sections 4.8 and 4.8.1 are preliminary rather than fully tabulated experiments. Their exact metrics are not recorded in the result files reported in this dissertation, so they are presented as exploratory observations and not as quantitative evidence. Re-running these checks with logged metrics is listed as future work.</w:t>
       </w:r>
     </w:p>
     <w:p>
@@ -14366,202 +14263,182 @@
         <w:pageBreakBefore/>
       </w:pPr>
       <w:r>
+        <w:t>6.5 Future Work</w:t>
+      </w:r>
+    </w:p>
+    <w:p>
+      <w:pPr>
+        <w:jc w:val="both"/>
+      </w:pPr>
+      <w:r>
+        <w:t>Because the 10% and 20% intermediate fine-tuning reruns are now complete, future work should no longer be framed as validating those two rows. The remaining methodological question is how those adaptation results compare with stronger target-domain baselines and additional controls. The main experimental direction is therefore target-domain evaluation and upper-bound comparison, rather than more zero-shot controls alone.</w:t>
+      </w:r>
+    </w:p>
+    <w:p>
+      <w:pPr>
+        <w:jc w:val="both"/>
+      </w:pPr>
+      <w:r>
+        <w:t>The most direct next step is to strengthen the target-domain evaluation further. A full FakeNewsNet in-domain transformer baseline, trained directly on the target training split without the LIAR source stage, would provide a clearer upper bound for the intermediate fine-tuning results. If full article text becomes available, the same protocol should also be repeated with richer input.</w:t>
+      </w:r>
+    </w:p>
+    <w:p>
+      <w:pPr>
+        <w:jc w:val="both"/>
+      </w:pPr>
+      <w:r>
+        <w:t>A second direction is to add another target dataset. This would make the cross-dataset claim stronger because the dissertation would not rely on one source-target pair. MultiFC or another fact-checking dataset could be considered if the label mapping and access conditions are manageable.</w:t>
+      </w:r>
+    </w:p>
+    <w:p>
+      <w:pPr>
+        <w:jc w:val="both"/>
+      </w:pPr>
+      <w:r>
+        <w:t>A third direction is to explore methods designed for domain robustness, such as domain-adaptive pretraining or more careful context integration. These methods should only be added if there is enough time to evaluate them clearly and avoid turning the dissertation into an uncontrolled model search.</w:t>
+      </w:r>
+    </w:p>
+    <w:p>
+      <w:pPr>
+        <w:jc w:val="both"/>
+      </w:pPr>
+      <w:r>
+        <w:t>A final direction is to keep TELLER as partial inspiration rather than a main experimental path unless full reproduction becomes feasible. The current atoms pilot is useful for discussing LLM reasoning-signal limitations, but the dissertation main contribution should remain the reproducible baseline, direct-transfer failure analysis, and intermediate fine-tuning recovery experiment.</w:t>
+      </w:r>
+    </w:p>
+    <w:p>
+      <w:r>
+        <w:br w:type="page"/>
+      </w:r>
+    </w:p>
+    <w:p>
+      <w:pPr>
+        <w:pageBreakBefore/>
+        <w:spacing w:before="720" w:after="360"/>
+      </w:pPr>
+      <w:r>
+        <w:t>Chapter 7</w:t>
+      </w:r>
+    </w:p>
+    <w:p>
+      <w:pPr>
+        <w:spacing w:after="480"/>
+      </w:pPr>
+      <w:r>
+        <w:t>Conclusion</w:t>
+      </w:r>
+    </w:p>
+    <w:p>
+      <w:pPr>
+        <w:pStyle w:val="21"/>
+      </w:pPr>
+      <w:r>
+        <w:t>7.1 Summary of the Study</w:t>
+      </w:r>
+    </w:p>
+    <w:p>
+      <w:pPr>
+        <w:jc w:val="both"/>
+      </w:pPr>
+      <w:r>
+        <w:t>This dissertation set out to evaluate standard fake news detection baselines on the LIAR dataset, to measure how well those baselines transfer to FakeNewsNet titles, and to test whether intermediate target-domain fine-tuning can recover performance after strict transfer failure. Starting from a deterministic TF-IDF + Logistic Regression reference, the study added BERT, class-weighted BERT, RoBERTa, and class-weighted RoBERTa under consistent binary label mapping, fixed data splits, and a five-seed evaluation protocol. A matched unweighted BERT control was run to isolate the role of class weighting, and a later intermediate fine-tuning experiment tested 5%, 10%, and 20% FakeNewsNet target-domain supervision.</w:t>
+      </w:r>
+    </w:p>
+    <w:p>
+      <w:pPr>
+        <w:jc w:val="both"/>
+      </w:pPr>
+      <w:r>
+        <w:t>The study also discusses TELLER as a recent advanced framework for fake news detection. TELLER reports stronger LIAR performance than the local baselines, but it uses an LLM-based reasoning pipeline rather than a standard BERT or RoBERTa classifier. It is therefore treated as an advanced literature comparison rather than as a directly reproduced local baseline. A simplified TELLER-like reasoning-atom pilot is included only as supporting analysis, not as a main contribution.</w:t>
+      </w:r>
+    </w:p>
+    <w:p>
+      <w:pPr>
+        <w:pStyle w:val="21"/>
+      </w:pPr>
+      <w:r>
+        <w:t>7.2 Answers to the Research Questions</w:t>
+      </w:r>
+    </w:p>
+    <w:p>
+      <w:pPr>
+        <w:jc w:val="both"/>
+      </w:pPr>
+      <w:r>
+        <w:t>RQ1 asked whether class-weighted training changes the balance between overall performance and FAKE recall. The answer is yes, but with a trade-off. Weighted BERT gives the highest mean FAKE recall among the completed local baselines, while weighted RoBERTa gives the highest mean Macro-F1. The paired five-seed tests do not show a statistically significant Macro-F1 advantage for the weighted variants at p &lt; .05, so the main finding is behavioural rather than a decisive ranking.</w:t>
+      </w:r>
+    </w:p>
+    <w:p>
+      <w:pPr>
+        <w:jc w:val="both"/>
+      </w:pPr>
+      <w:r>
+        <w:t>RQ2 asked what kinds of inputs the best local models still misclassify. The representative errors cluster around numeric claims that require external evidence, context-dependent statements whose truth value depends on background knowledge not present in the text, and label-boundary cases where the original LIAR fine-grained label sits close to the REAL/FAKE boundary. These patterns suggest that statement-only text often provides insufficient signal for binary veracity judgement.</w:t>
+      </w:r>
+    </w:p>
+    <w:p>
+      <w:pPr>
+        <w:jc w:val="both"/>
+      </w:pPr>
+      <w:r>
+        <w:t>RQ3 asked whether LIAR-trained classifiers remain reliable on FakeNewsNet titles without adaptation, compared with trivial baselines. Under strict direct transfer, the answer is no. Weighted BERT and weighted RoBERTa perform well in-domain but over-predict FAKE on FakeNewsNet titles, producing very low REAL recall; both fall below the always-REAL majority baseline on the combined target. The unweighted BERT control shows that this is not primarily caused by class weighting.</w:t>
+      </w:r>
+    </w:p>
+    <w:p>
+      <w:pPr>
+        <w:jc w:val="both"/>
+      </w:pPr>
+      <w:r>
+        <w:t>RQ4 asked how much labelled target-domain data intermediate fine-tuning needs to recover the transfer failure. The 5% setting remains unstable seed-42 evidence, but the five-seed 10% and 20% settings substantially improve held-out FakeNewsNet performance. The 10% setting reaches 0.7035 Macro-F1 and the 20% setting reaches 0.7463; both are significantly higher than direct transfer, and 20% is also significantly higher than 10%.</w:t>
+      </w:r>
+    </w:p>
+    <w:p>
+      <w:pPr>
+        <w:pStyle w:val="21"/>
+      </w:pPr>
+      <w:r>
+        <w:t>7.3 Main Outcomes</w:t>
+      </w:r>
+    </w:p>
+    <w:p>
+      <w:pPr>
+        <w:jc w:val="both"/>
+      </w:pPr>
+      <w:r>
+        <w:t>The first outcome is a reproducible LIAR binary baseline setup with fixed splits, consistent label mapping, and five-seed transformer evaluation. The second outcome is a class-sensitive comparison demonstrating that the model with the highest mean Macro-F1 and the model with the highest mean FAKE recall are not the same model, and that Accuracy alone cannot reveal this distinction. The third outcome is a strict cross-dataset transfer evaluation showing that higher LIAR performance does not guarantee higher FakeNewsNet performance, and that the FAKE over-prediction observed for BERT persists when class weights are removed. The fourth outcome is an intermediate fine-tuning result showing that target-domain supervision can recover performance once enough labelled FakeNewsNet examples are used. The strongest improvement was obtained with 20% FakeNewsNet intermediate fine-tuning, while the simplified TELLER-like pilot showed that coarse LLM-generated reasoning atoms were insufficient to resolve cross-dataset shift.</w:t>
+      </w:r>
+    </w:p>
+    <w:p>
+      <w:pPr>
+        <w:pStyle w:val="21"/>
+      </w:pPr>
+      <w:r>
+        <w:t>7.4 Limitations</w:t>
+      </w:r>
+    </w:p>
+    <w:p>
+      <w:pPr>
+        <w:jc w:val="both"/>
+      </w:pPr>
+      <w:r>
+        <w:t>The main limitation is that the cross-dataset target uses FakeNewsNet minimal titles rather than full article text. This means the transfer and adaptation settings are useful for short-text generalisation, but they do not fully represent article-level fake news detection. Another limitation is that only the 10% and 20% intermediate fine-tuning settings have five-seed support; the 5% setting remains seed-42 only and should be interpreted cautiously. A third limitation is that only one target dataset family has been tested, so the cross-dataset conclusion should be expanded with additional datasets if time and data access allow.</w:t>
+      </w:r>
+      <w:r/>
+    </w:p>
+    <w:p>
+      <w:pPr>
+        <w:jc w:val="both"/>
+      </w:pPr>
+      <w:r>
+        <w:t>A further limitation is that some advanced systems from the literature, especially TELLER, have not been reproduced locally. This means a published framework with higher reported LIAR scores is discussed rather than directly implemented, so the dissertation should not be read as a direct experimental comparison between TELLER and the local baselines. The simplified reasoning-atom pilot is useful for probing whether LLM-generated signals reduce class bias, but it is not a full TELLER reproduction and remains exploratory. A final methodological limitation is that the matched unweighted-transfer control has been completed for BERT but not yet for RoBERTa; this remains a useful secondary control, although the main next step is now target-domain upper-bound evaluation.</w:t>
+      </w:r>
+    </w:p>
+    <w:p>
+      <w:pPr>
+        <w:pStyle w:val="21"/>
+      </w:pPr>
+      <w:r>
         <w:t>7.5 Future Work</w:t>
-      </w:r>
-    </w:p>
-    <w:p>
-      <w:pPr>
-        <w:jc w:val="both"/>
-      </w:pPr>
-      <w:r>
-        <w:t>Because the 10% and 20% intermediate fine-tuning reruns are now complete, future work should no longer be framed as validating those two rows. The remaining methodological question is how those adaptation results compare with stronger target-domain baselines and additional controls. The main experimental direction is therefore target-domain evaluation and upper-bound comparison, rather than more zero-shot controls alone.</w:t>
-      </w:r>
-    </w:p>
-    <w:p>
-      <w:pPr>
-        <w:jc w:val="both"/>
-      </w:pPr>
-      <w:r>
-        <w:t>The most direct next step is to strengthen the target-domain evaluation further. A full FakeNewsNet in-domain transformer baseline, trained directly on the target training split without the LIAR source stage, would provide a clearer upper bound for the intermediate fine-tuning results. If full article text becomes available, the same protocol should also be repeated with richer input.</w:t>
-      </w:r>
-    </w:p>
-    <w:p>
-      <w:pPr>
-        <w:jc w:val="both"/>
-      </w:pPr>
-      <w:r>
-        <w:t>A second direction is to add another target dataset. This would make the cross-dataset claim stronger because the dissertation would not rely on one source-target pair. MultiFC or another fact-checking dataset could be considered if the label mapping and access conditions are manageable.</w:t>
-      </w:r>
-    </w:p>
-    <w:p>
-      <w:pPr>
-        <w:jc w:val="both"/>
-      </w:pPr>
-      <w:r>
-        <w:t>A third direction is to explore methods designed for domain robustness, such as domain-adaptive pretraining or more careful context integration. These methods should only be added if there is enough time to evaluate them clearly and avoid turning the dissertation into an uncontrolled model search.</w:t>
-      </w:r>
-    </w:p>
-    <w:p>
-      <w:pPr>
-        <w:jc w:val="both"/>
-      </w:pPr>
-      <w:r>
-        <w:t>A final direction is to keep TELLER as partial inspiration rather than a main experimental path unless full reproduction becomes feasible. The current atoms pilot is useful for discussing LLM reasoning-signal limitations, but the dissertation main contribution should remain the reproducible baseline, direct-transfer failure analysis, and intermediate fine-tuning recovery experiment.</w:t>
-      </w:r>
-    </w:p>
-    <w:p>
-      <w:r>
-        <w:br w:type="page"/>
-      </w:r>
-    </w:p>
-    <w:p>
-      <w:pPr>
-        <w:spacing w:before="720" w:after="360"/>
-      </w:pPr>
-      <w:r>
-        <w:rPr>
-          <w:b/>
-          <w:sz w:val="48"/>
-        </w:rPr>
-        <w:lastRenderedPageBreak/>
-        <w:t>Chapter 8</w:t>
-      </w:r>
-    </w:p>
-    <w:p>
-      <w:pPr>
-        <w:spacing w:after="480"/>
-      </w:pPr>
-      <w:r>
-        <w:rPr>
-          <w:b/>
-          <w:sz w:val="48"/>
-        </w:rPr>
-        <w:t>Conclusion</w:t>
-      </w:r>
-    </w:p>
-    <w:p>
-      <w:pPr>
-        <w:pStyle w:val="21"/>
-      </w:pPr>
-      <w:r>
-        <w:t>8.1 Summary of the Study</w:t>
-      </w:r>
-    </w:p>
-    <w:p>
-      <w:pPr>
-        <w:jc w:val="both"/>
-      </w:pPr>
-      <w:r>
-        <w:t>This dissertation set out to evaluate reproducible fake news detection baselines on the LIAR dataset, to measure how well those baselines transfer to FakeNewsNet titles, and to test whether intermediate target-domain fine-tuning can recover performance after strict transfer failure. Starting from a deterministic TF-IDF + Logistic Regression reference, the study added BERT, class-weighted BERT, RoBERTa, and class-weighted RoBERTa under consistent binary label mapping, fixed data splits, and a five-seed evaluation protocol. A matched unweighted BERT control was run to isolate the role of class weighting, and a later intermediate fine-tuning experiment tested 5%, 10%, and 20% FakeNewsNet target-domain supervision.</w:t>
-      </w:r>
-    </w:p>
-    <w:p>
-      <w:pPr>
-        <w:jc w:val="both"/>
-      </w:pPr>
-      <w:r>
-        <w:t>The study also discusses TELLER as a recent advanced framework for fake news detection. TELLER reports stronger LIAR performance than the local baselines, but it uses an LLM-based reasoning pipeline rather than a standard BERT or RoBERTa classifier. It is therefore treated as an advanced literature comparison rather than as a directly reproduced local baseline. A simplified TELLER-like reasoning-atom pilot is included only as supporting analysis, not as a main contribution.</w:t>
-      </w:r>
-    </w:p>
-    <w:p>
-      <w:pPr>
-        <w:pStyle w:val="21"/>
-      </w:pPr>
-      <w:r>
-        <w:t>8.2 Answers to the Research Questions</w:t>
-      </w:r>
-    </w:p>
-    <w:p>
-      <w:pPr>
-        <w:jc w:val="both"/>
-      </w:pPr>
-      <w:r>
-        <w:t>RQ1 asked how traditional and transformer-based classifiers perform on LIAR binary fake news detection. The answer is that transformer models improve over TF-IDF, but the improvement is moderate. Weighted RoBERTa obtains the highest mean Accuracy and Macro-F1 among the completed local baselines, with 0.6522 Accuracy and 0.6396 Macro-F1 across five seeds, although the gap to weighted BERT is modest and was not tested for statistical significance.</w:t>
-      </w:r>
-    </w:p>
-    <w:p>
-      <w:pPr>
-        <w:jc w:val="both"/>
-      </w:pPr>
-      <w:r>
-        <w:t>RQ2 asked whether class-weighted training improves Macro-F1 or FAKE recall. The answer is mixed but useful. Weighted BERT improves Macro-F1 compared with unweighted BERT and gives the highest mean FAKE recall among the completed local baselines. Weighted RoBERTa has higher mean overall metrics, showing a trade-off between balanced performance and FAKE-class sensitivity.</w:t>
-      </w:r>
-    </w:p>
-    <w:p>
-      <w:pPr>
-        <w:jc w:val="both"/>
-      </w:pPr>
-      <w:r>
-        <w:t xml:space="preserve">RQ3 asked what kinds of LIAR test items are most often misclassified by the best-performing local model. A qualitative review of representative errors shows that mistakes cluster around three patterns: numeric claims that require external evidence to </w:t>
-      </w:r>
-      <w:r>
-        <w:lastRenderedPageBreak/>
-        <w:t>verify, context-dependent statements whose truth value depends on background knowledge not present in the text, and label-boundary cases where the original LIAR fine-grained label sits close to the REAL/FAKE boundary. These patterns are consistent across both weighted BERT and weighted RoBERTa and suggest that statement-only text often provides insufficient signal for binary veracity judgement.</w:t>
-      </w:r>
-    </w:p>
-    <w:p>
-      <w:pPr>
-        <w:jc w:val="both"/>
-      </w:pPr>
-      <w:r>
-        <w:t>RQ4 asked how local baselines should be compared with advanced systems such as TELLER. The answer is a feasibility-level discussion rather than an experimental result: TELLER is only partly comparable because it is an LLM-based reasoning framework, not a standard BERT or RoBERTa classifier, and it has not been reproduced locally in this dissertation. It is therefore treated as an advanced literature comparison rather than a directly evaluated baseline.</w:t>
-      </w:r>
-    </w:p>
-    <w:p>
-      <w:pPr>
-        <w:jc w:val="both"/>
-      </w:pPr>
-      <w:r>
-        <w:t>RQ5 asked how well LIAR-trained baselines transfer to FakeNewsNet minimal titles. Under strict direct transfer, the answer is weak: weighted BERT and weighted RoBERTa perform well in-domain but over-predict FAKE on FakeNewsNet titles, producing very low REAL recall, and the unweighted BERT control shows that this is not primarily caused by class weighting. However, intermediate target-domain fine-tuning changes the result. Five percent FakeNewsNet fine-tuning remains biased toward REAL predictions in the seed-42 run, but the five-seed 10% and 20% target-domain fine-tuning results substantially improve the held-out FakeNewsNet test result, with the 20% setting reaching 0.7463 Macro-F1.</w:t>
-      </w:r>
-    </w:p>
-    <w:p>
-      <w:pPr>
-        <w:pStyle w:val="21"/>
-      </w:pPr>
-      <w:r>
-        <w:t>8.3 Main Outcomes</w:t>
-      </w:r>
-    </w:p>
-    <w:p>
-      <w:pPr>
-        <w:jc w:val="both"/>
-      </w:pPr>
-      <w:r>
-        <w:t>The first outcome is a reproducible LIAR binary baseline setup with fixed splits, consistent label mapping, and five-seed transformer evaluation. The second outcome is a class-sensitive comparison demonstrating that the model with the highest mean Macro-F1 and the model with the highest mean FAKE recall are not the same model, and that Accuracy alone cannot reveal this distinction. The third outcome is a strict cross-dataset transfer evaluation showing that higher LIAR performance does not guarantee higher FakeNewsNet performance, and that the FAKE over-prediction observed for BERT persists when class weights are removed. The fourth outcome is an intermediate fine-tuning result showing that target-domain supervision can recover performance once enough labelled FakeNewsNet examples are used. The strongest improvement was obtained with 20% FakeNewsNet intermediate fine-tuning, while the simplified TELLER-like pilot showed that coarse LLM-generated reasoning atoms were insufficient to resolve cross-dataset shift.</w:t>
-      </w:r>
-    </w:p>
-    <w:p>
-      <w:pPr>
-        <w:pStyle w:val="21"/>
-      </w:pPr>
-      <w:r>
-        <w:t>8.4 Limitations</w:t>
-      </w:r>
-    </w:p>
-    <w:p>
-      <w:pPr>
-        <w:jc w:val="both"/>
-      </w:pPr>
-      <w:r>
-        <w:t>The main limitation is that the cross-dataset target uses FakeNewsNet minimal titles rather than full article text. This means the transfer and adaptation settings are useful for short-text generalisation, but they do not fully represent article-level fake news detection. Another limitation is that only the 10% and 20% intermediate fine-tuning settings have five-seed support; the 5% setting remains seed-42 only and should be interpreted cautiously. A third limitation is that only one target dataset family has been tested, so the cross-dataset conclusion should be expanded with additional datasets if time and data access allow.</w:t>
-      </w:r>
-      <w:r/>
-    </w:p>
-    <w:p>
-      <w:pPr>
-        <w:jc w:val="both"/>
-      </w:pPr>
-      <w:r>
-        <w:t>A further limitation is that some advanced systems from the literature, especially TELLER, have not been reproduced locally. This means a published framework with higher reported LIAR scores is discussed rather than directly implemented, so the dissertation should not be read as a direct experimental comparison between TELLER and the local baselines. The simplified reasoning-atom pilot is useful for probing whether LLM-generated signals reduce class bias, but it is not a full TELLER reproduction and remains exploratory. A final methodological limitation is that the matched unweighted-transfer control has been completed for BERT but not yet for RoBERTa; this remains a useful secondary control, although the main next step is now target-domain upper-bound evaluation.</w:t>
-      </w:r>
-    </w:p>
-    <w:p>
-      <w:pPr>
-        <w:pStyle w:val="21"/>
-      </w:pPr>
-      <w:r>
-        <w:t>8.5 Future Work</w:t>
       </w:r>
     </w:p>
     <w:p>
@@ -15109,7 +14986,7 @@
             </w:pPr>
             <w:r>
               <w:rPr>
-                <w:sz w:val="18"/>
+                <w:b w:val="0"/>
               </w:rPr>
               <w:t>0.6235</w:t>
             </w:r>
@@ -15137,7 +15014,7 @@
             </w:pPr>
             <w:r>
               <w:rPr>
-                <w:sz w:val="18"/>
+                <w:b w:val="0"/>
               </w:rPr>
               <w:t>0.6005</w:t>
             </w:r>
@@ -15165,7 +15042,7 @@
             </w:pPr>
             <w:r>
               <w:rPr>
-                <w:sz w:val="18"/>
+                <w:b/>
               </w:rPr>
               <w:t>0.7661</w:t>
             </w:r>
@@ -15193,7 +15070,7 @@
             </w:pPr>
             <w:r>
               <w:rPr>
-                <w:sz w:val="18"/>
+                <w:b w:val="0"/>
               </w:rPr>
               <w:t>0.4394</w:t>
             </w:r>
@@ -15280,7 +15157,8 @@
             </w:pPr>
             <w:r>
               <w:rPr>
-                <w:sz w:val="18"/>
+                <w:b w:val="0"/>
+                <w:u w:val="single"/>
               </w:rPr>
               <w:t>0.6412 +/- 0.0065</w:t>
             </w:r>
@@ -15308,7 +15186,8 @@
             </w:pPr>
             <w:r>
               <w:rPr>
-                <w:sz w:val="18"/>
+                <w:b w:val="0"/>
+                <w:u w:val="single"/>
               </w:rPr>
               <w:t>0.6322 +/- 0.0090</w:t>
             </w:r>
@@ -15336,7 +15215,7 @@
             </w:pPr>
             <w:r>
               <w:rPr>
-                <w:sz w:val="18"/>
+                <w:b w:val="0"/>
               </w:rPr>
               <w:t>0.7048 +/- 0.0292</w:t>
             </w:r>
@@ -15364,7 +15243,7 @@
             </w:pPr>
             <w:r>
               <w:rPr>
-                <w:sz w:val="18"/>
+                <w:b/>
               </w:rPr>
               <w:t>0.5591 +/- 0.0447</w:t>
             </w:r>
@@ -15451,7 +15330,7 @@
             </w:pPr>
             <w:r>
               <w:rPr>
-                <w:sz w:val="18"/>
+                <w:b/>
               </w:rPr>
               <w:t>0.6522 +/- 0.0074</w:t>
             </w:r>
@@ -15479,7 +15358,7 @@
             </w:pPr>
             <w:r>
               <w:rPr>
-                <w:sz w:val="18"/>
+                <w:b/>
               </w:rPr>
               <w:t>0.6396 +/- 0.0080</w:t>
             </w:r>
@@ -15507,7 +15386,8 @@
             </w:pPr>
             <w:r>
               <w:rPr>
-                <w:sz w:val="18"/>
+                <w:b w:val="0"/>
+                <w:u w:val="single"/>
               </w:rPr>
               <w:t>0.7443 +/- 0.0153</w:t>
             </w:r>
@@ -15535,7 +15415,8 @@
             </w:pPr>
             <w:r>
               <w:rPr>
-                <w:sz w:val="18"/>
+                <w:b w:val="0"/>
+                <w:u w:val="single"/>
               </w:rPr>
               <w:t>0.5335 +/- 0.0199</w:t>
             </w:r>
@@ -15622,7 +15503,7 @@
             </w:pPr>
             <w:r>
               <w:rPr>
-                <w:sz w:val="18"/>
+                <w:b/>
               </w:rPr>
               <w:t>0.4993</w:t>
             </w:r>
@@ -15650,7 +15531,7 @@
             </w:pPr>
             <w:r>
               <w:rPr>
-                <w:sz w:val="18"/>
+                <w:b/>
               </w:rPr>
               <w:t>0.4745</w:t>
             </w:r>
@@ -15678,7 +15559,7 @@
             </w:pPr>
             <w:r>
               <w:rPr>
-                <w:sz w:val="18"/>
+                <w:b/>
               </w:rPr>
               <w:t>0.4766</w:t>
             </w:r>
@@ -15706,7 +15587,7 @@
             </w:pPr>
             <w:r>
               <w:rPr>
-                <w:sz w:val="18"/>
+                <w:b w:val="0"/>
               </w:rPr>
               <w:t>0.5682</w:t>
             </w:r>
@@ -15793,7 +15674,8 @@
             </w:pPr>
             <w:r>
               <w:rPr>
-                <w:sz w:val="18"/>
+                <w:b w:val="0"/>
+                <w:u w:val="single"/>
               </w:rPr>
               <w:t>0.2935 +/- 0.0234</w:t>
             </w:r>
@@ -15821,7 +15703,8 @@
             </w:pPr>
             <w:r>
               <w:rPr>
-                <w:sz w:val="18"/>
+                <w:b w:val="0"/>
+                <w:u w:val="single"/>
               </w:rPr>
               <w:t>0.2682 +/- 0.0342</w:t>
             </w:r>
@@ -15849,7 +15732,8 @@
             </w:pPr>
             <w:r>
               <w:rPr>
-                <w:sz w:val="18"/>
+                <w:b w:val="0"/>
+                <w:u w:val="single"/>
               </w:rPr>
               <w:t>0.0747 +/- 0.0414</w:t>
             </w:r>
@@ -15877,7 +15761,8 @@
             </w:pPr>
             <w:r>
               <w:rPr>
-                <w:sz w:val="18"/>
+                <w:b w:val="0"/>
+                <w:u w:val="single"/>
               </w:rPr>
               <w:t>0.9564 +/- 0.0320</w:t>
             </w:r>
@@ -15964,7 +15849,7 @@
             </w:pPr>
             <w:r>
               <w:rPr>
-                <w:sz w:val="18"/>
+                <w:b w:val="0"/>
               </w:rPr>
               <w:t>0.2718 +/- 0.0154</w:t>
             </w:r>
@@ -15992,7 +15877,7 @@
             </w:pPr>
             <w:r>
               <w:rPr>
-                <w:sz w:val="18"/>
+                <w:b w:val="0"/>
               </w:rPr>
               <w:t>0.2358 +/- 0.0229</w:t>
             </w:r>
@@ -16020,7 +15905,7 @@
             </w:pPr>
             <w:r>
               <w:rPr>
-                <w:sz w:val="18"/>
+                <w:b w:val="0"/>
               </w:rPr>
               <w:t>0.0372 +/- 0.0245</w:t>
             </w:r>
@@ -16048,7 +15933,7 @@
             </w:pPr>
             <w:r>
               <w:rPr>
-                <w:sz w:val="18"/>
+                <w:b/>
               </w:rPr>
               <w:t>0.9827 +/- 0.0126</w:t>
             </w:r>
@@ -16084,6 +15969,11 @@
         </w:tc>
       </w:tr>
     </w:tbl>
+    <w:p>
+      <w:r>
+        <w:t>Note. Bold marks the best comparable value within a column; underlining marks the second-best. Statistical significance is not shown for deterministic, single-seed, or non-comparable literature rows.</w:t>
+      </w:r>
+    </w:p>
     <w:p/>
     <w:p>
       <w:pPr>
@@ -18901,7 +18791,7 @@
         <w:ind w:left="454" w:hanging="170"/>
       </w:pPr>
       <w:r>
-        <w:t>Run notebooks/11_cross_dataset_results_summary_figures.py to regenerate summary tables and figures for Chapter 6.</w:t>
+        <w:t>Run notebooks/11_cross_dataset_results_summary_figures.py to regenerate summary tables and figures for Chapter 5.</w:t>
       </w:r>
     </w:p>
     <w:sectPr>

</xml_diff>

<commit_message>
Final QA fixes after supervisor-revision round: restore JG's 'strict' deletion in abstract (now 'direct'), remove draft-process wording from 3.1 and 6.5
</commit_message>
<xml_diff>
--- a/thesis_writeup/dissertation_current.docx
+++ b/thesis_writeup/dissertation_current.docx
@@ -228,7 +228,7 @@
         <w:jc w:val="both"/>
       </w:pPr>
       <w:r>
-        <w:t>The study uses the LIAR benchmark of political fact-checking statements as the source dataset and FakeNewsNet minimal titles, drawn from PolitiFact and GossipCop, as the target dataset. It compares TF-IDF with Logistic Regression, BERT, RoBERTa, and class-weighted variants using Accuracy, Macro-F1, REAL recall, and FAKE recall. It then tests strict LIAR-to-FakeNewsNet transfer, intermediate fine-tuning with limited labelled FakeNewsNet target data, and within-FakeNewsNet subpart transfer.</w:t>
+        <w:t>The study uses the LIAR benchmark of political fact-checking statements as the source dataset and FakeNewsNet minimal titles, drawn from PolitiFact and GossipCop, as the target dataset. It compares TF-IDF with Logistic Regression, BERT, RoBERTa, and class-weighted variants using Accuracy, Macro-F1, REAL recall, and FAKE recall. It then tests direct LIAR-to-FakeNewsNet transfer, intermediate fine-tuning with limited labelled FakeNewsNet target data, and within-FakeNewsNet subpart transfer.</w:t>
       </w:r>
     </w:p>
     <w:p>
@@ -236,7 +236,7 @@
         <w:jc w:val="both"/>
       </w:pPr>
       <w:r>
-        <w:t>In-domain, weighted RoBERTa obtains the highest local LIAR Macro-F1 (0.6396), although the paired five-seed tests do not make the local transformer ranking statistically decisive. Under strict transfer to held-out FakeNewsNet titles, the same model collapses to 0.2364 Macro-F1 and falls below the always-REAL majority baseline, with a strong FAKE prediction bias. A matched unweighted BERT control indicates that distribution shift, rather than class weighting alone, is the main cause. Intermediate target-domain fine-tuning substantially recovers performance: 10% target data reaches 0.7035 Macro-F1 and 20% reaches 0.7463, both significantly above direct transfer.</w:t>
+        <w:t>In-domain, weighted RoBERTa obtains the highest local LIAR Macro-F1 (0.6396), although the paired five-seed tests do not make the local transformer ranking statistically decisive. Under direct transfer to held-out FakeNewsNet titles, the same model collapses to 0.2364 Macro-F1 and falls below the always-REAL majority baseline, with a strong FAKE prediction bias. A matched unweighted BERT control indicates that distribution shift, rather than class weighting alone, is the main cause. Intermediate target-domain fine-tuning substantially recovers performance: 10% target data reaches 0.7035 Macro-F1 and 20% reaches 0.7463, both significantly above direct transfer.</w:t>
       </w:r>
     </w:p>
     <w:p>
@@ -2576,7 +2576,7 @@
     <w:p>
       <w:pPr/>
       <w:r>
-        <w:t>Reading of Table 3.1: E1-E2 establish what the models can do in-domain; E3 tests whether that performance survives a strict change of dataset; E4 is the main adaptation experiment; E5 explains the E3 failure; E6 is a small exploratory pilot; and E7 tests transfer between FakeNewsNet's own subparts (PolitiFact and GossipCop). Experiments E4-E7 are recent additions and are the reason this chapter has been updated.</w:t>
+        <w:t>Reading of Table 3.1: E1-E2 establish what the models can do in-domain; E3 tests whether that performance survives a strict change of dataset; E4 is the main adaptation experiment; E5 explains the E3 failure; E6 is a small exploratory pilot; and E7 tests transfer between FakeNewsNet's own subparts (PolitiFact and GossipCop).</w:t>
       </w:r>
     </w:p>
     <w:p>
@@ -14271,7 +14271,7 @@
         <w:jc w:val="both"/>
       </w:pPr>
       <w:r>
-        <w:t>Because the 10% and 20% intermediate fine-tuning reruns are now complete, future work should no longer be framed as validating those two rows. The remaining methodological question is how those adaptation results compare with stronger target-domain baselines and additional controls. The main experimental direction is therefore target-domain evaluation and upper-bound comparison, rather than more zero-shot controls alone.</w:t>
+        <w:t>With the 10% and 20% intermediate fine-tuning results established over five seeds, the remaining methodological question is how those adaptation results compare with stronger target-domain baselines and additional controls. The main experimental direction is therefore target-domain evaluation and upper-bound comparison, rather than more zero-shot controls alone.</w:t>
       </w:r>
     </w:p>
     <w:p>

</xml_diff>